<commit_message>
programa del curso para virtualizar
</commit_message>
<xml_diff>
--- a/promocion_investigacion_didactica_del_ml/virtualizacion_propuesta/PropuestasVirtualización_Marco.docx
+++ b/promocion_investigacion_didactica_del_ml/virtualizacion_propuesta/PropuestasVirtualización_Marco.docx
@@ -2219,7 +2219,7 @@
                 <w:sz w:val="22"/>
                 <w:szCs w:val="22"/>
               </w:rPr>
-              <w:t xml:space="preserve">McKinney, W. (2012). </w:t>
+              <w:t xml:space="preserve">McKinney, W. (2022). </w:t>
             </w:r>
             <w:r>
               <w:rPr>
@@ -2230,7 +2230,7 @@
                 <w:sz w:val="22"/>
                 <w:szCs w:val="22"/>
               </w:rPr>
-              <w:t>Python for data analysis: Data wrangling with Pandas, NumPy, and IPython</w:t>
+              <w:t>Python for data analysis</w:t>
             </w:r>
             <w:r>
               <w:rPr>

</xml_diff>

<commit_message>
begin discuss household chores
</commit_message>
<xml_diff>
--- a/promocion_investigacion_didactica_del_ml/virtualizacion_propuesta/PropuestasVirtualización_Marco.docx
+++ b/promocion_investigacion_didactica_del_ml/virtualizacion_propuesta/PropuestasVirtualización_Marco.docx
@@ -543,25 +543,7 @@
                 <w:sz w:val="22"/>
                 <w:szCs w:val="22"/>
               </w:rPr>
-              <w:t xml:space="preserve">Informática y Ciencias de la </w:t>
-            </w:r>
-            <w:r>
-              <w:rPr>
-                <w:rFonts w:eastAsia="Calibri" w:cs="Calibri" w:ascii="Calibri" w:hAnsi="Calibri"/>
-                <w:color w:val="808080"/>
-                <w:sz w:val="22"/>
-                <w:szCs w:val="22"/>
-              </w:rPr>
-              <w:t>C</w:t>
-            </w:r>
-            <w:r>
-              <w:rPr>
-                <w:rFonts w:eastAsia="Calibri" w:cs="Calibri" w:ascii="Calibri" w:hAnsi="Calibri"/>
-                <w:color w:val="808080"/>
-                <w:sz w:val="22"/>
-                <w:szCs w:val="22"/>
-              </w:rPr>
-              <w:t>omputación</w:t>
+              <w:t>Informática y Ciencias de la Computación</w:t>
             </w:r>
           </w:p>
         </w:tc>
@@ -715,8 +697,8 @@
         <w:tblLook w:val="0600"/>
       </w:tblPr>
       <w:tblGrid>
-        <w:gridCol w:w="3051"/>
-        <w:gridCol w:w="3271"/>
+        <w:gridCol w:w="3050"/>
+        <w:gridCol w:w="3272"/>
         <w:gridCol w:w="4173"/>
       </w:tblGrid>
       <w:tr>
@@ -832,27 +814,7 @@
                 <w:sz w:val="22"/>
                 <w:szCs w:val="22"/>
               </w:rPr>
-              <w:t xml:space="preserve">Introducción a la </w:t>
-            </w:r>
-            <w:r>
-              <w:rPr>
-                <w:rFonts w:eastAsia="Calibri" w:cs="Calibri" w:ascii="Calibri" w:hAnsi="Calibri"/>
-                <w:b/>
-                <w:color w:val="808080"/>
-                <w:sz w:val="22"/>
-                <w:szCs w:val="22"/>
-              </w:rPr>
-              <w:t xml:space="preserve">Ciencia de datos con técnicas de Machine Learning </w:t>
-            </w:r>
-            <w:r>
-              <w:rPr>
-                <w:rFonts w:eastAsia="Calibri" w:cs="Calibri" w:ascii="Calibri" w:hAnsi="Calibri"/>
-                <w:b/>
-                <w:color w:val="808080"/>
-                <w:sz w:val="22"/>
-                <w:szCs w:val="22"/>
-              </w:rPr>
-              <w:t>en lenguaje python</w:t>
+              <w:t>Introducción a la Ciencia de datos con técnicas de Machine Learning en lenguaje python</w:t>
             </w:r>
           </w:p>
         </w:tc>
@@ -955,6 +917,863 @@
               </w:rPr>
               <w:t>Realizar una descripción general que considere el propósito del curso en coherencia con los objetivos de formación del programa académico.</w:t>
             </w:r>
+            <w:r>
+              <w:rPr>
+                <w:b/>
+                <w:color w:val="808080"/>
+                <w:sz w:val="22"/>
+                <w:szCs w:val="22"/>
+              </w:rPr>
+              <w:t xml:space="preserve">  </w:t>
+            </w:r>
+          </w:p>
+          <w:p>
+            <w:pPr>
+              <w:pStyle w:val="Normal1"/>
+              <w:rPr>
+                <w:b/>
+                <w:sz w:val="22"/>
+                <w:szCs w:val="22"/>
+              </w:rPr>
+            </w:pPr>
+            <w:r>
+              <w:rPr/>
+            </w:r>
+          </w:p>
+          <w:p>
+            <w:pPr>
+              <w:pStyle w:val="Normal1"/>
+              <w:rPr>
+                <w:b/>
+                <w:sz w:val="22"/>
+                <w:szCs w:val="22"/>
+              </w:rPr>
+            </w:pPr>
+            <w:r>
+              <w:rPr>
+                <w:b/>
+                <w:color w:val="808080"/>
+                <w:sz w:val="22"/>
+                <w:szCs w:val="22"/>
+              </w:rPr>
+              <w:t>**Curso de Introducción al Machine Learning con Python**</w:t>
+            </w:r>
+          </w:p>
+          <w:p>
+            <w:pPr>
+              <w:pStyle w:val="Normal1"/>
+              <w:rPr>
+                <w:b/>
+                <w:sz w:val="22"/>
+                <w:szCs w:val="22"/>
+              </w:rPr>
+            </w:pPr>
+            <w:r>
+              <w:rPr/>
+            </w:r>
+          </w:p>
+          <w:p>
+            <w:pPr>
+              <w:pStyle w:val="Normal1"/>
+              <w:rPr>
+                <w:b/>
+                <w:sz w:val="22"/>
+                <w:szCs w:val="22"/>
+              </w:rPr>
+            </w:pPr>
+            <w:r>
+              <w:rPr>
+                <w:b/>
+                <w:color w:val="808080"/>
+                <w:sz w:val="22"/>
+                <w:szCs w:val="22"/>
+              </w:rPr>
+              <w:t>**Descripción:**</w:t>
+            </w:r>
+          </w:p>
+          <w:p>
+            <w:pPr>
+              <w:pStyle w:val="Normal1"/>
+              <w:rPr>
+                <w:b/>
+                <w:sz w:val="22"/>
+                <w:szCs w:val="22"/>
+              </w:rPr>
+            </w:pPr>
+            <w:r>
+              <w:rPr>
+                <w:b/>
+                <w:color w:val="808080"/>
+                <w:sz w:val="22"/>
+                <w:szCs w:val="22"/>
+              </w:rPr>
+              <w:t>Este curso de introducción al machine learning con Python está diseñado para usuarios de la Universidad de Antioquia que deseen adquirir habilidades en ciencia de datos y machine learning. El curso tiene una duración de 16 horas y se imparte en modalidad virtual autogestionada, lo que permite a los participantes avanzar a su propio ritmo.</w:t>
+            </w:r>
+          </w:p>
+          <w:p>
+            <w:pPr>
+              <w:pStyle w:val="Normal1"/>
+              <w:rPr>
+                <w:b/>
+                <w:sz w:val="22"/>
+                <w:szCs w:val="22"/>
+              </w:rPr>
+            </w:pPr>
+            <w:r>
+              <w:rPr/>
+            </w:r>
+          </w:p>
+          <w:p>
+            <w:pPr>
+              <w:pStyle w:val="Normal1"/>
+              <w:rPr>
+                <w:b/>
+                <w:sz w:val="22"/>
+                <w:szCs w:val="22"/>
+              </w:rPr>
+            </w:pPr>
+            <w:r>
+              <w:rPr>
+                <w:b/>
+                <w:color w:val="808080"/>
+                <w:sz w:val="22"/>
+                <w:szCs w:val="22"/>
+              </w:rPr>
+              <w:t>**Contenidos:**</w:t>
+            </w:r>
+          </w:p>
+          <w:p>
+            <w:pPr>
+              <w:pStyle w:val="Normal1"/>
+              <w:rPr>
+                <w:b/>
+                <w:sz w:val="22"/>
+                <w:szCs w:val="22"/>
+              </w:rPr>
+            </w:pPr>
+            <w:r>
+              <w:rPr>
+                <w:b/>
+                <w:color w:val="808080"/>
+                <w:sz w:val="22"/>
+                <w:szCs w:val="22"/>
+              </w:rPr>
+              <w:t>1. **Introducción a Python para Ciencia de Datos:**</w:t>
+            </w:r>
+          </w:p>
+          <w:p>
+            <w:pPr>
+              <w:pStyle w:val="Normal1"/>
+              <w:rPr>
+                <w:b/>
+                <w:sz w:val="22"/>
+                <w:szCs w:val="22"/>
+              </w:rPr>
+            </w:pPr>
+            <w:r>
+              <w:rPr>
+                <w:b/>
+                <w:color w:val="808080"/>
+                <w:sz w:val="22"/>
+                <w:szCs w:val="22"/>
+              </w:rPr>
+              <w:t xml:space="preserve">   </w:t>
+            </w:r>
+            <w:r>
+              <w:rPr>
+                <w:b/>
+                <w:color w:val="808080"/>
+                <w:sz w:val="22"/>
+                <w:szCs w:val="22"/>
+              </w:rPr>
+              <w:t>- Fundamentos de Python: variables, tipos de datos, estructuras de control.</w:t>
+            </w:r>
+          </w:p>
+          <w:p>
+            <w:pPr>
+              <w:pStyle w:val="Normal1"/>
+              <w:rPr>
+                <w:b/>
+                <w:sz w:val="22"/>
+                <w:szCs w:val="22"/>
+              </w:rPr>
+            </w:pPr>
+            <w:r>
+              <w:rPr>
+                <w:b/>
+                <w:color w:val="808080"/>
+                <w:sz w:val="22"/>
+                <w:szCs w:val="22"/>
+              </w:rPr>
+              <w:t xml:space="preserve">   </w:t>
+            </w:r>
+            <w:r>
+              <w:rPr>
+                <w:b/>
+                <w:color w:val="808080"/>
+                <w:sz w:val="22"/>
+                <w:szCs w:val="22"/>
+              </w:rPr>
+              <w:t>- Bibliotecas para Ciencia de Datos en Python: NumPy, Pandas, Matplotlib.</w:t>
+            </w:r>
+          </w:p>
+          <w:p>
+            <w:pPr>
+              <w:pStyle w:val="Normal1"/>
+              <w:rPr>
+                <w:b/>
+                <w:sz w:val="22"/>
+                <w:szCs w:val="22"/>
+              </w:rPr>
+            </w:pPr>
+            <w:r>
+              <w:rPr>
+                <w:b/>
+                <w:color w:val="808080"/>
+                <w:sz w:val="22"/>
+                <w:szCs w:val="22"/>
+              </w:rPr>
+              <w:t xml:space="preserve">   </w:t>
+            </w:r>
+            <w:r>
+              <w:rPr>
+                <w:b/>
+                <w:color w:val="808080"/>
+                <w:sz w:val="22"/>
+                <w:szCs w:val="22"/>
+              </w:rPr>
+              <w:t>- Manipulación y visualización de datos con Pandas y Matplotlib.</w:t>
+            </w:r>
+          </w:p>
+          <w:p>
+            <w:pPr>
+              <w:pStyle w:val="Normal1"/>
+              <w:rPr>
+                <w:b/>
+                <w:sz w:val="22"/>
+                <w:szCs w:val="22"/>
+              </w:rPr>
+            </w:pPr>
+            <w:r>
+              <w:rPr/>
+            </w:r>
+          </w:p>
+          <w:p>
+            <w:pPr>
+              <w:pStyle w:val="Normal1"/>
+              <w:rPr>
+                <w:b/>
+                <w:sz w:val="22"/>
+                <w:szCs w:val="22"/>
+              </w:rPr>
+            </w:pPr>
+            <w:r>
+              <w:rPr>
+                <w:b/>
+                <w:color w:val="808080"/>
+                <w:sz w:val="22"/>
+                <w:szCs w:val="22"/>
+              </w:rPr>
+              <w:t>2. **Elementos Básicos de Estadística para Ciencia de Datos:**</w:t>
+            </w:r>
+          </w:p>
+          <w:p>
+            <w:pPr>
+              <w:pStyle w:val="Normal1"/>
+              <w:rPr>
+                <w:b/>
+                <w:sz w:val="22"/>
+                <w:szCs w:val="22"/>
+              </w:rPr>
+            </w:pPr>
+            <w:r>
+              <w:rPr>
+                <w:b/>
+                <w:color w:val="808080"/>
+                <w:sz w:val="22"/>
+                <w:szCs w:val="22"/>
+              </w:rPr>
+              <w:t xml:space="preserve">   </w:t>
+            </w:r>
+            <w:r>
+              <w:rPr>
+                <w:b/>
+                <w:color w:val="808080"/>
+                <w:sz w:val="22"/>
+                <w:szCs w:val="22"/>
+              </w:rPr>
+              <w:t>- Estadísticas descriptivas: medidas de tendencia central, dispersión y distribución.</w:t>
+            </w:r>
+          </w:p>
+          <w:p>
+            <w:pPr>
+              <w:pStyle w:val="Normal1"/>
+              <w:rPr>
+                <w:b/>
+                <w:sz w:val="22"/>
+                <w:szCs w:val="22"/>
+              </w:rPr>
+            </w:pPr>
+            <w:r>
+              <w:rPr>
+                <w:b/>
+                <w:color w:val="808080"/>
+                <w:sz w:val="22"/>
+                <w:szCs w:val="22"/>
+              </w:rPr>
+              <w:t xml:space="preserve">   </w:t>
+            </w:r>
+            <w:r>
+              <w:rPr>
+                <w:b/>
+                <w:color w:val="808080"/>
+                <w:sz w:val="22"/>
+                <w:szCs w:val="22"/>
+              </w:rPr>
+              <w:t>- Probabilidad y distribuciones de probabilidad.</w:t>
+            </w:r>
+          </w:p>
+          <w:p>
+            <w:pPr>
+              <w:pStyle w:val="Normal1"/>
+              <w:rPr>
+                <w:b/>
+                <w:sz w:val="22"/>
+                <w:szCs w:val="22"/>
+              </w:rPr>
+            </w:pPr>
+            <w:r>
+              <w:rPr>
+                <w:b/>
+                <w:color w:val="808080"/>
+                <w:sz w:val="22"/>
+                <w:szCs w:val="22"/>
+              </w:rPr>
+              <w:t xml:space="preserve">   </w:t>
+            </w:r>
+            <w:r>
+              <w:rPr>
+                <w:b/>
+                <w:color w:val="808080"/>
+                <w:sz w:val="22"/>
+                <w:szCs w:val="22"/>
+              </w:rPr>
+              <w:t>- Inferencia estadística básica: intervalos de confianza, pruebas de hipótesis.</w:t>
+            </w:r>
+          </w:p>
+          <w:p>
+            <w:pPr>
+              <w:pStyle w:val="Normal1"/>
+              <w:rPr>
+                <w:b/>
+                <w:sz w:val="22"/>
+                <w:szCs w:val="22"/>
+              </w:rPr>
+            </w:pPr>
+            <w:r>
+              <w:rPr/>
+            </w:r>
+          </w:p>
+          <w:p>
+            <w:pPr>
+              <w:pStyle w:val="Normal1"/>
+              <w:rPr>
+                <w:b/>
+                <w:sz w:val="22"/>
+                <w:szCs w:val="22"/>
+              </w:rPr>
+            </w:pPr>
+            <w:r>
+              <w:rPr>
+                <w:b/>
+                <w:color w:val="808080"/>
+                <w:sz w:val="22"/>
+                <w:szCs w:val="22"/>
+              </w:rPr>
+              <w:t>3. **Modelos de Regresión:**</w:t>
+            </w:r>
+          </w:p>
+          <w:p>
+            <w:pPr>
+              <w:pStyle w:val="Normal1"/>
+              <w:rPr>
+                <w:b/>
+                <w:sz w:val="22"/>
+                <w:szCs w:val="22"/>
+              </w:rPr>
+            </w:pPr>
+            <w:r>
+              <w:rPr>
+                <w:b/>
+                <w:color w:val="808080"/>
+                <w:sz w:val="22"/>
+                <w:szCs w:val="22"/>
+              </w:rPr>
+              <w:t xml:space="preserve">   </w:t>
+            </w:r>
+            <w:r>
+              <w:rPr>
+                <w:b/>
+                <w:color w:val="808080"/>
+                <w:sz w:val="22"/>
+                <w:szCs w:val="22"/>
+              </w:rPr>
+              <w:t>- Conceptos básicos de regresión.</w:t>
+            </w:r>
+          </w:p>
+          <w:p>
+            <w:pPr>
+              <w:pStyle w:val="Normal1"/>
+              <w:rPr>
+                <w:b/>
+                <w:sz w:val="22"/>
+                <w:szCs w:val="22"/>
+              </w:rPr>
+            </w:pPr>
+            <w:r>
+              <w:rPr>
+                <w:b/>
+                <w:color w:val="808080"/>
+                <w:sz w:val="22"/>
+                <w:szCs w:val="22"/>
+              </w:rPr>
+              <w:t xml:space="preserve">   </w:t>
+            </w:r>
+            <w:r>
+              <w:rPr>
+                <w:b/>
+                <w:color w:val="808080"/>
+                <w:sz w:val="22"/>
+                <w:szCs w:val="22"/>
+              </w:rPr>
+              <w:t>- Regresión lineal y regresión polinómica.</w:t>
+            </w:r>
+          </w:p>
+          <w:p>
+            <w:pPr>
+              <w:pStyle w:val="Normal1"/>
+              <w:rPr>
+                <w:b/>
+                <w:sz w:val="22"/>
+                <w:szCs w:val="22"/>
+              </w:rPr>
+            </w:pPr>
+            <w:r>
+              <w:rPr>
+                <w:b/>
+                <w:color w:val="808080"/>
+                <w:sz w:val="22"/>
+                <w:szCs w:val="22"/>
+              </w:rPr>
+              <w:t xml:space="preserve">   </w:t>
+            </w:r>
+            <w:r>
+              <w:rPr>
+                <w:b/>
+                <w:color w:val="808080"/>
+                <w:sz w:val="22"/>
+                <w:szCs w:val="22"/>
+              </w:rPr>
+              <w:t>- Evaluación de modelos de regresión.</w:t>
+            </w:r>
+          </w:p>
+          <w:p>
+            <w:pPr>
+              <w:pStyle w:val="Normal1"/>
+              <w:rPr>
+                <w:b/>
+                <w:sz w:val="22"/>
+                <w:szCs w:val="22"/>
+              </w:rPr>
+            </w:pPr>
+            <w:r>
+              <w:rPr/>
+            </w:r>
+          </w:p>
+          <w:p>
+            <w:pPr>
+              <w:pStyle w:val="Normal1"/>
+              <w:rPr>
+                <w:b/>
+                <w:sz w:val="22"/>
+                <w:szCs w:val="22"/>
+              </w:rPr>
+            </w:pPr>
+            <w:r>
+              <w:rPr>
+                <w:b/>
+                <w:color w:val="808080"/>
+                <w:sz w:val="22"/>
+                <w:szCs w:val="22"/>
+              </w:rPr>
+              <w:t>4. **Modelos de Clasificación:**</w:t>
+            </w:r>
+          </w:p>
+          <w:p>
+            <w:pPr>
+              <w:pStyle w:val="Normal1"/>
+              <w:rPr>
+                <w:b/>
+                <w:sz w:val="22"/>
+                <w:szCs w:val="22"/>
+              </w:rPr>
+            </w:pPr>
+            <w:r>
+              <w:rPr>
+                <w:b/>
+                <w:color w:val="808080"/>
+                <w:sz w:val="22"/>
+                <w:szCs w:val="22"/>
+              </w:rPr>
+              <w:t xml:space="preserve">   </w:t>
+            </w:r>
+            <w:r>
+              <w:rPr>
+                <w:b/>
+                <w:color w:val="808080"/>
+                <w:sz w:val="22"/>
+                <w:szCs w:val="22"/>
+              </w:rPr>
+              <w:t>- Conceptos básicos de clasificación.</w:t>
+            </w:r>
+          </w:p>
+          <w:p>
+            <w:pPr>
+              <w:pStyle w:val="Normal1"/>
+              <w:rPr>
+                <w:b/>
+                <w:sz w:val="22"/>
+                <w:szCs w:val="22"/>
+              </w:rPr>
+            </w:pPr>
+            <w:r>
+              <w:rPr>
+                <w:b/>
+                <w:color w:val="808080"/>
+                <w:sz w:val="22"/>
+                <w:szCs w:val="22"/>
+              </w:rPr>
+              <w:t xml:space="preserve">   </w:t>
+            </w:r>
+            <w:r>
+              <w:rPr>
+                <w:b/>
+                <w:color w:val="808080"/>
+                <w:sz w:val="22"/>
+                <w:szCs w:val="22"/>
+              </w:rPr>
+              <w:t>- Algoritmos de clasificación: K-Nearest Neighbors, Árboles de Decisión, Random Forest.</w:t>
+            </w:r>
+          </w:p>
+          <w:p>
+            <w:pPr>
+              <w:pStyle w:val="Normal1"/>
+              <w:rPr>
+                <w:b/>
+                <w:sz w:val="22"/>
+                <w:szCs w:val="22"/>
+              </w:rPr>
+            </w:pPr>
+            <w:r>
+              <w:rPr>
+                <w:b/>
+                <w:color w:val="808080"/>
+                <w:sz w:val="22"/>
+                <w:szCs w:val="22"/>
+              </w:rPr>
+              <w:t xml:space="preserve">   </w:t>
+            </w:r>
+            <w:r>
+              <w:rPr>
+                <w:b/>
+                <w:color w:val="808080"/>
+                <w:sz w:val="22"/>
+                <w:szCs w:val="22"/>
+              </w:rPr>
+              <w:t>- Evaluación de modelos de clasificación.</w:t>
+            </w:r>
+          </w:p>
+          <w:p>
+            <w:pPr>
+              <w:pStyle w:val="Normal1"/>
+              <w:rPr>
+                <w:b/>
+                <w:sz w:val="22"/>
+                <w:szCs w:val="22"/>
+              </w:rPr>
+            </w:pPr>
+            <w:r>
+              <w:rPr/>
+            </w:r>
+          </w:p>
+          <w:p>
+            <w:pPr>
+              <w:pStyle w:val="Normal1"/>
+              <w:rPr>
+                <w:b/>
+                <w:sz w:val="22"/>
+                <w:szCs w:val="22"/>
+              </w:rPr>
+            </w:pPr>
+            <w:r>
+              <w:rPr>
+                <w:b/>
+                <w:color w:val="808080"/>
+                <w:sz w:val="22"/>
+                <w:szCs w:val="22"/>
+              </w:rPr>
+              <w:t>5. **Aplicación Práctica con Datos Reales del Proyecto Investigativo Antioquia Mira Su Cielo:**</w:t>
+            </w:r>
+          </w:p>
+          <w:p>
+            <w:pPr>
+              <w:pStyle w:val="Normal1"/>
+              <w:rPr>
+                <w:b/>
+                <w:sz w:val="22"/>
+                <w:szCs w:val="22"/>
+              </w:rPr>
+            </w:pPr>
+            <w:r>
+              <w:rPr>
+                <w:b/>
+                <w:color w:val="808080"/>
+                <w:sz w:val="22"/>
+                <w:szCs w:val="22"/>
+              </w:rPr>
+              <w:t xml:space="preserve">   </w:t>
+            </w:r>
+            <w:r>
+              <w:rPr>
+                <w:b/>
+                <w:color w:val="808080"/>
+                <w:sz w:val="22"/>
+                <w:szCs w:val="22"/>
+              </w:rPr>
+              <w:t>- Introducción al proyecto Antioquia Mira Su Cielo.</w:t>
+            </w:r>
+          </w:p>
+          <w:p>
+            <w:pPr>
+              <w:pStyle w:val="Normal1"/>
+              <w:rPr>
+                <w:b/>
+                <w:sz w:val="22"/>
+                <w:szCs w:val="22"/>
+              </w:rPr>
+            </w:pPr>
+            <w:r>
+              <w:rPr>
+                <w:b/>
+                <w:color w:val="808080"/>
+                <w:sz w:val="22"/>
+                <w:szCs w:val="22"/>
+              </w:rPr>
+              <w:t xml:space="preserve">   </w:t>
+            </w:r>
+            <w:r>
+              <w:rPr>
+                <w:b/>
+                <w:color w:val="808080"/>
+                <w:sz w:val="22"/>
+                <w:szCs w:val="22"/>
+              </w:rPr>
+              <w:t>- Preparación y exploración de datos.</w:t>
+            </w:r>
+          </w:p>
+          <w:p>
+            <w:pPr>
+              <w:pStyle w:val="Normal1"/>
+              <w:rPr>
+                <w:b/>
+                <w:sz w:val="22"/>
+                <w:szCs w:val="22"/>
+              </w:rPr>
+            </w:pPr>
+            <w:r>
+              <w:rPr>
+                <w:b/>
+                <w:color w:val="808080"/>
+                <w:sz w:val="22"/>
+                <w:szCs w:val="22"/>
+              </w:rPr>
+              <w:t xml:space="preserve">   </w:t>
+            </w:r>
+            <w:r>
+              <w:rPr>
+                <w:b/>
+                <w:color w:val="808080"/>
+                <w:sz w:val="22"/>
+                <w:szCs w:val="22"/>
+              </w:rPr>
+              <w:t>- Construcción y evaluación de modelos predictivos utilizando técnicas de machine learning.</w:t>
+            </w:r>
+          </w:p>
+          <w:p>
+            <w:pPr>
+              <w:pStyle w:val="Normal1"/>
+              <w:rPr>
+                <w:b/>
+                <w:sz w:val="22"/>
+                <w:szCs w:val="22"/>
+              </w:rPr>
+            </w:pPr>
+            <w:r>
+              <w:rPr/>
+            </w:r>
+          </w:p>
+          <w:p>
+            <w:pPr>
+              <w:pStyle w:val="Normal1"/>
+              <w:rPr>
+                <w:b/>
+                <w:sz w:val="22"/>
+                <w:szCs w:val="22"/>
+              </w:rPr>
+            </w:pPr>
+            <w:r>
+              <w:rPr>
+                <w:b/>
+                <w:color w:val="808080"/>
+                <w:sz w:val="22"/>
+                <w:szCs w:val="22"/>
+              </w:rPr>
+              <w:t>**Metodología:**</w:t>
+            </w:r>
+          </w:p>
+          <w:p>
+            <w:pPr>
+              <w:pStyle w:val="Normal1"/>
+              <w:rPr>
+                <w:b/>
+                <w:sz w:val="22"/>
+                <w:szCs w:val="22"/>
+              </w:rPr>
+            </w:pPr>
+            <w:r>
+              <w:rPr>
+                <w:b/>
+                <w:color w:val="808080"/>
+                <w:sz w:val="22"/>
+                <w:szCs w:val="22"/>
+              </w:rPr>
+              <w:t>El curso se presenta con un enfoque pedagógico de aula invertida, donde los participantes acceden a clases diseñadas en cuadernos Jupyter alojados en el repositorio "didactica_ciencia_datos" de la red social GitHub, en la cuenta "marco-canas". Estas clases están articuladas con video clases disponibles en la red social YouTube, en la cuenta "DiMathData", centradas en la didáctica de la matemática y la ciencia de datos.</w:t>
+            </w:r>
+          </w:p>
+          <w:p>
+            <w:pPr>
+              <w:pStyle w:val="Normal1"/>
+              <w:rPr>
+                <w:b/>
+                <w:sz w:val="22"/>
+                <w:szCs w:val="22"/>
+              </w:rPr>
+            </w:pPr>
+            <w:r>
+              <w:rPr/>
+            </w:r>
+          </w:p>
+          <w:p>
+            <w:pPr>
+              <w:pStyle w:val="Normal1"/>
+              <w:rPr>
+                <w:b/>
+                <w:sz w:val="22"/>
+                <w:szCs w:val="22"/>
+              </w:rPr>
+            </w:pPr>
+            <w:r>
+              <w:rPr>
+                <w:b/>
+                <w:color w:val="808080"/>
+                <w:sz w:val="22"/>
+                <w:szCs w:val="22"/>
+              </w:rPr>
+              <w:t>**Requisitos:**</w:t>
+            </w:r>
+          </w:p>
+          <w:p>
+            <w:pPr>
+              <w:pStyle w:val="Normal1"/>
+              <w:rPr>
+                <w:b/>
+                <w:sz w:val="22"/>
+                <w:szCs w:val="22"/>
+              </w:rPr>
+            </w:pPr>
+            <w:r>
+              <w:rPr>
+                <w:b/>
+                <w:color w:val="808080"/>
+                <w:sz w:val="22"/>
+                <w:szCs w:val="22"/>
+              </w:rPr>
+              <w:t>No se requieren conocimientos previos en programación o estadística, pero se recomienda tener un nivel básico de familiaridad con Python y conceptos matemáticos.</w:t>
+            </w:r>
+          </w:p>
+          <w:p>
+            <w:pPr>
+              <w:pStyle w:val="Normal1"/>
+              <w:rPr>
+                <w:b/>
+                <w:sz w:val="22"/>
+                <w:szCs w:val="22"/>
+              </w:rPr>
+            </w:pPr>
+            <w:r>
+              <w:rPr/>
+            </w:r>
+          </w:p>
+          <w:p>
+            <w:pPr>
+              <w:pStyle w:val="Normal1"/>
+              <w:rPr>
+                <w:b/>
+                <w:sz w:val="22"/>
+                <w:szCs w:val="22"/>
+              </w:rPr>
+            </w:pPr>
+            <w:r>
+              <w:rPr>
+                <w:b/>
+                <w:color w:val="808080"/>
+                <w:sz w:val="22"/>
+                <w:szCs w:val="22"/>
+              </w:rPr>
+              <w:t>**Certificación:**</w:t>
+            </w:r>
+          </w:p>
+          <w:p>
+            <w:pPr>
+              <w:pStyle w:val="Normal1"/>
+              <w:rPr>
+                <w:b/>
+                <w:sz w:val="22"/>
+                <w:szCs w:val="22"/>
+              </w:rPr>
+            </w:pPr>
+            <w:r>
+              <w:rPr>
+                <w:b/>
+                <w:color w:val="808080"/>
+                <w:sz w:val="22"/>
+                <w:szCs w:val="22"/>
+              </w:rPr>
+              <w:t>Al completar el curso, los participantes recibirán un certificado de finalización emitido por la Universidad de Antioquia.</w:t>
+            </w:r>
+          </w:p>
+          <w:p>
+            <w:pPr>
+              <w:pStyle w:val="Normal1"/>
+              <w:rPr>
+                <w:b/>
+                <w:sz w:val="22"/>
+                <w:szCs w:val="22"/>
+              </w:rPr>
+            </w:pPr>
+            <w:r>
+              <w:rPr/>
+            </w:r>
           </w:p>
         </w:tc>
       </w:tr>
@@ -1055,7 +1874,231 @@
                 <w:sz w:val="22"/>
                 <w:szCs w:val="22"/>
               </w:rPr>
-              <w:t>.</w:t>
+              <w:t xml:space="preserve">.  </w:t>
+            </w:r>
+          </w:p>
+          <w:p>
+            <w:pPr>
+              <w:pStyle w:val="Normal1"/>
+              <w:rPr>
+                <w:rFonts w:ascii="Calibri" w:hAnsi="Calibri" w:eastAsia="Calibri" w:cs="Calibri"/>
+              </w:rPr>
+            </w:pPr>
+            <w:r>
+              <w:rPr/>
+            </w:r>
+          </w:p>
+          <w:p>
+            <w:pPr>
+              <w:pStyle w:val="Normal1"/>
+              <w:rPr>
+                <w:rFonts w:ascii="Calibri" w:hAnsi="Calibri" w:eastAsia="Calibri" w:cs="Calibri"/>
+              </w:rPr>
+            </w:pPr>
+            <w:r>
+              <w:rPr>
+                <w:rFonts w:eastAsia="Calibri" w:cs="Calibri" w:ascii="Calibri" w:hAnsi="Calibri"/>
+                <w:color w:val="808080"/>
+                <w:sz w:val="22"/>
+                <w:szCs w:val="22"/>
+              </w:rPr>
+              <w:t>**Justificación:**</w:t>
+            </w:r>
+          </w:p>
+          <w:p>
+            <w:pPr>
+              <w:pStyle w:val="Normal1"/>
+              <w:rPr>
+                <w:rFonts w:ascii="Calibri" w:hAnsi="Calibri" w:eastAsia="Calibri" w:cs="Calibri"/>
+              </w:rPr>
+            </w:pPr>
+            <w:r>
+              <w:rPr/>
+            </w:r>
+          </w:p>
+          <w:p>
+            <w:pPr>
+              <w:pStyle w:val="Normal1"/>
+              <w:rPr>
+                <w:rFonts w:ascii="Calibri" w:hAnsi="Calibri" w:eastAsia="Calibri" w:cs="Calibri"/>
+              </w:rPr>
+            </w:pPr>
+            <w:r>
+              <w:rPr>
+                <w:rFonts w:eastAsia="Calibri" w:cs="Calibri" w:ascii="Calibri" w:hAnsi="Calibri"/>
+                <w:color w:val="808080"/>
+                <w:sz w:val="22"/>
+                <w:szCs w:val="22"/>
+              </w:rPr>
+              <w:t>La ciencia de datos y el machine learning son áreas de creciente importancia en el mundo contemporáneo, con aplicaciones en una amplia variedad de campos, desde la investigación científica hasta la toma de decisiones empresariales. La Universidad de Antioquia reconoce la necesidad de proporcionar a sus estudiantes y profesionales herramientas y habilidades en estas áreas para enfrentar los desafíos del mundo laboral actual y contribuir al avance de la investigación y el desarrollo en la región.</w:t>
+            </w:r>
+          </w:p>
+          <w:p>
+            <w:pPr>
+              <w:pStyle w:val="Normal1"/>
+              <w:rPr>
+                <w:rFonts w:ascii="Calibri" w:hAnsi="Calibri" w:eastAsia="Calibri" w:cs="Calibri"/>
+              </w:rPr>
+            </w:pPr>
+            <w:r>
+              <w:rPr/>
+            </w:r>
+          </w:p>
+          <w:p>
+            <w:pPr>
+              <w:pStyle w:val="Normal1"/>
+              <w:rPr>
+                <w:rFonts w:ascii="Calibri" w:hAnsi="Calibri" w:eastAsia="Calibri" w:cs="Calibri"/>
+              </w:rPr>
+            </w:pPr>
+            <w:r>
+              <w:rPr>
+                <w:rFonts w:eastAsia="Calibri" w:cs="Calibri" w:ascii="Calibri" w:hAnsi="Calibri"/>
+                <w:color w:val="808080"/>
+                <w:sz w:val="22"/>
+                <w:szCs w:val="22"/>
+              </w:rPr>
+              <w:t>La justificación para este curso se basa en los siguientes puntos:</w:t>
+            </w:r>
+          </w:p>
+          <w:p>
+            <w:pPr>
+              <w:pStyle w:val="Normal1"/>
+              <w:rPr>
+                <w:rFonts w:ascii="Calibri" w:hAnsi="Calibri" w:eastAsia="Calibri" w:cs="Calibri"/>
+              </w:rPr>
+            </w:pPr>
+            <w:r>
+              <w:rPr/>
+            </w:r>
+          </w:p>
+          <w:p>
+            <w:pPr>
+              <w:pStyle w:val="Normal1"/>
+              <w:rPr>
+                <w:rFonts w:ascii="Calibri" w:hAnsi="Calibri" w:eastAsia="Calibri" w:cs="Calibri"/>
+              </w:rPr>
+            </w:pPr>
+            <w:r>
+              <w:rPr>
+                <w:rFonts w:eastAsia="Calibri" w:cs="Calibri" w:ascii="Calibri" w:hAnsi="Calibri"/>
+                <w:color w:val="808080"/>
+                <w:sz w:val="22"/>
+                <w:szCs w:val="22"/>
+              </w:rPr>
+              <w:t>1. **Demanda de habilidades en Ciencia de Datos y Machine Learning:** Existe una creciente demanda de profesionales con habilidades en ciencia de datos y machine learning en la industria y el mercado laboral. Los empleadores buscan candidatos que puedan analizar grandes volúmenes de datos, extraer información relevante y construir modelos predictivos para mejorar la toma de decisiones.</w:t>
+            </w:r>
+          </w:p>
+          <w:p>
+            <w:pPr>
+              <w:pStyle w:val="Normal1"/>
+              <w:rPr>
+                <w:rFonts w:ascii="Calibri" w:hAnsi="Calibri" w:eastAsia="Calibri" w:cs="Calibri"/>
+              </w:rPr>
+            </w:pPr>
+            <w:r>
+              <w:rPr/>
+            </w:r>
+          </w:p>
+          <w:p>
+            <w:pPr>
+              <w:pStyle w:val="Normal1"/>
+              <w:rPr>
+                <w:rFonts w:ascii="Calibri" w:hAnsi="Calibri" w:eastAsia="Calibri" w:cs="Calibri"/>
+              </w:rPr>
+            </w:pPr>
+            <w:r>
+              <w:rPr>
+                <w:rFonts w:eastAsia="Calibri" w:cs="Calibri" w:ascii="Calibri" w:hAnsi="Calibri"/>
+                <w:color w:val="808080"/>
+                <w:sz w:val="22"/>
+                <w:szCs w:val="22"/>
+              </w:rPr>
+              <w:t>2. **Relevancia para la Investigación y el Desarrollo:** La Universidad de Antioquia está comprometida con la generación de conocimiento y la innovación en diversos campos, incluyendo la astronomía y la investigación espacial. El proyecto Antioquia Mira Su Cielo ofrece una oportunidad única para aplicar técnicas de ciencia de datos y machine learning en un contexto real, contribuyendo así al avance de la investigación y el desarrollo en la región.</w:t>
+            </w:r>
+          </w:p>
+          <w:p>
+            <w:pPr>
+              <w:pStyle w:val="Normal1"/>
+              <w:rPr>
+                <w:rFonts w:ascii="Calibri" w:hAnsi="Calibri" w:eastAsia="Calibri" w:cs="Calibri"/>
+              </w:rPr>
+            </w:pPr>
+            <w:r>
+              <w:rPr/>
+            </w:r>
+          </w:p>
+          <w:p>
+            <w:pPr>
+              <w:pStyle w:val="Normal1"/>
+              <w:rPr>
+                <w:rFonts w:ascii="Calibri" w:hAnsi="Calibri" w:eastAsia="Calibri" w:cs="Calibri"/>
+              </w:rPr>
+            </w:pPr>
+            <w:r>
+              <w:rPr>
+                <w:rFonts w:eastAsia="Calibri" w:cs="Calibri" w:ascii="Calibri" w:hAnsi="Calibri"/>
+                <w:color w:val="808080"/>
+                <w:sz w:val="22"/>
+                <w:szCs w:val="22"/>
+              </w:rPr>
+              <w:t>3. **Acceso a Recursos Educativos en Línea:** La modalidad virtual autogestionada del curso permite a los participantes acceder a materiales educativos de alta calidad en cualquier momento y desde cualquier lugar, lo que facilita la participación de estudiantes y profesionales que tienen compromisos laborales o académicos.</w:t>
+            </w:r>
+          </w:p>
+          <w:p>
+            <w:pPr>
+              <w:pStyle w:val="Normal1"/>
+              <w:rPr>
+                <w:rFonts w:ascii="Calibri" w:hAnsi="Calibri" w:eastAsia="Calibri" w:cs="Calibri"/>
+              </w:rPr>
+            </w:pPr>
+            <w:r>
+              <w:rPr/>
+            </w:r>
+          </w:p>
+          <w:p>
+            <w:pPr>
+              <w:pStyle w:val="Normal1"/>
+              <w:rPr>
+                <w:rFonts w:ascii="Calibri" w:hAnsi="Calibri" w:eastAsia="Calibri" w:cs="Calibri"/>
+              </w:rPr>
+            </w:pPr>
+            <w:r>
+              <w:rPr>
+                <w:rFonts w:eastAsia="Calibri" w:cs="Calibri" w:ascii="Calibri" w:hAnsi="Calibri"/>
+                <w:color w:val="808080"/>
+                <w:sz w:val="22"/>
+                <w:szCs w:val="22"/>
+              </w:rPr>
+              <w:t>4. **Enfoque Pedagógico Innovador:** El enfoque pedagógico de aula invertida, combinado con el uso de cuadernos Jupyter y video clases, proporciona a los participantes una experiencia de aprendizaje interactiva y práctica, donde pueden aplicar los conceptos y técnicas aprendidos en proyectos reales y colaborativos.</w:t>
+            </w:r>
+          </w:p>
+          <w:p>
+            <w:pPr>
+              <w:pStyle w:val="Normal1"/>
+              <w:rPr>
+                <w:rFonts w:ascii="Calibri" w:hAnsi="Calibri" w:eastAsia="Calibri" w:cs="Calibri"/>
+              </w:rPr>
+            </w:pPr>
+            <w:r>
+              <w:rPr/>
+            </w:r>
+          </w:p>
+          <w:p>
+            <w:pPr>
+              <w:pStyle w:val="Normal1"/>
+              <w:rPr>
+                <w:rFonts w:ascii="Calibri" w:hAnsi="Calibri" w:eastAsia="Calibri" w:cs="Calibri"/>
+              </w:rPr>
+            </w:pPr>
+            <w:r>
+              <w:rPr>
+                <w:rFonts w:eastAsia="Calibri" w:cs="Calibri" w:ascii="Calibri" w:hAnsi="Calibri"/>
+                <w:color w:val="808080"/>
+                <w:sz w:val="22"/>
+                <w:szCs w:val="22"/>
+              </w:rPr>
+              <w:t>En resumen, este curso de introducción al machine learning con Python se justifica por su relevancia para el mercado laboral, su contribución al avance de la investigación y el desarrollo en la región, y su enfoque innovador en la entrega de contenidos educativos.</w:t>
             </w:r>
           </w:p>
         </w:tc>
@@ -1110,7 +2153,29 @@
                 <w:sz w:val="22"/>
                 <w:szCs w:val="22"/>
               </w:rPr>
-              <w:t>Escribir el objetivo general o el propósito principal del curso. En caso de que el curso esté definido por competencias, se describirán las competencias generales.</w:t>
+              <w:t xml:space="preserve">Escribir el objetivo general o el propósito principal del curso. En caso de que el curso esté definido por competencias, se describirán las competencias generales.  </w:t>
+            </w:r>
+          </w:p>
+          <w:p>
+            <w:pPr>
+              <w:pStyle w:val="Normal1"/>
+              <w:rPr>
+                <w:rFonts w:ascii="Calibri" w:hAnsi="Calibri" w:eastAsia="Calibri" w:cs="Calibri"/>
+              </w:rPr>
+            </w:pPr>
+            <w:r>
+              <w:rPr/>
+            </w:r>
+          </w:p>
+          <w:p>
+            <w:pPr>
+              <w:pStyle w:val="Normal1"/>
+              <w:rPr>
+                <w:rFonts w:ascii="Calibri" w:hAnsi="Calibri" w:eastAsia="Calibri" w:cs="Calibri"/>
+              </w:rPr>
+            </w:pPr>
+            <w:r>
+              <w:rPr/>
             </w:r>
           </w:p>
         </w:tc>
@@ -1355,7 +2420,7 @@
         </w:trPr>
         <w:tc>
           <w:tcPr>
-            <w:tcW w:w="3051" w:type="dxa"/>
+            <w:tcW w:w="3050" w:type="dxa"/>
             <w:tcBorders>
               <w:top w:val="single" w:sz="4" w:space="0" w:color="7F7F7F"/>
               <w:left w:val="single" w:sz="4" w:space="0" w:color="7F7F7F"/>
@@ -1385,7 +2450,7 @@
         </w:tc>
         <w:tc>
           <w:tcPr>
-            <w:tcW w:w="3271" w:type="dxa"/>
+            <w:tcW w:w="3272" w:type="dxa"/>
             <w:tcBorders>
               <w:top w:val="single" w:sz="4" w:space="0" w:color="7F7F7F"/>
               <w:left w:val="single" w:sz="4" w:space="0" w:color="7F7F7F"/>
@@ -1776,8 +2841,8 @@
         <w:tblLook w:val="0600"/>
       </w:tblPr>
       <w:tblGrid>
-        <w:gridCol w:w="4193"/>
-        <w:gridCol w:w="6283"/>
+        <w:gridCol w:w="4192"/>
+        <w:gridCol w:w="6284"/>
       </w:tblGrid>
       <w:tr>
         <w:trPr>
@@ -1825,7 +2890,7 @@
         </w:trPr>
         <w:tc>
           <w:tcPr>
-            <w:tcW w:w="4193" w:type="dxa"/>
+            <w:tcW w:w="4192" w:type="dxa"/>
             <w:tcBorders>
               <w:top w:val="single" w:sz="4" w:space="0" w:color="7F7F7F"/>
               <w:left w:val="single" w:sz="4" w:space="0" w:color="7F7F7F"/>
@@ -1855,7 +2920,7 @@
         </w:tc>
         <w:tc>
           <w:tcPr>
-            <w:tcW w:w="6283" w:type="dxa"/>
+            <w:tcW w:w="6284" w:type="dxa"/>
             <w:tcBorders>
               <w:top w:val="single" w:sz="4" w:space="0" w:color="7F7F7F"/>
               <w:left w:val="single" w:sz="4" w:space="0" w:color="7F7F7F"/>
@@ -1894,7 +2959,7 @@
         </w:trPr>
         <w:tc>
           <w:tcPr>
-            <w:tcW w:w="4193" w:type="dxa"/>
+            <w:tcW w:w="4192" w:type="dxa"/>
             <w:tcBorders>
               <w:top w:val="single" w:sz="4" w:space="0" w:color="7F7F7F"/>
               <w:left w:val="single" w:sz="4" w:space="0" w:color="7F7F7F"/>
@@ -1924,7 +2989,7 @@
         </w:tc>
         <w:tc>
           <w:tcPr>
-            <w:tcW w:w="6283" w:type="dxa"/>
+            <w:tcW w:w="6284" w:type="dxa"/>
             <w:tcBorders>
               <w:top w:val="single" w:sz="4" w:space="0" w:color="7F7F7F"/>
               <w:left w:val="single" w:sz="4" w:space="0" w:color="7F7F7F"/>
@@ -1963,7 +3028,7 @@
         </w:trPr>
         <w:tc>
           <w:tcPr>
-            <w:tcW w:w="4193" w:type="dxa"/>
+            <w:tcW w:w="4192" w:type="dxa"/>
             <w:tcBorders>
               <w:top w:val="single" w:sz="4" w:space="0" w:color="7F7F7F"/>
               <w:left w:val="single" w:sz="4" w:space="0" w:color="7F7F7F"/>
@@ -1993,7 +3058,7 @@
         </w:tc>
         <w:tc>
           <w:tcPr>
-            <w:tcW w:w="6283" w:type="dxa"/>
+            <w:tcW w:w="6284" w:type="dxa"/>
             <w:tcBorders>
               <w:top w:val="single" w:sz="4" w:space="0" w:color="7F7F7F"/>
               <w:left w:val="single" w:sz="4" w:space="0" w:color="7F7F7F"/>
@@ -2145,7 +3210,10 @@
               </w:rPr>
             </w:pPr>
             <w:r>
-              <w:rPr/>
+              <w:rPr>
+                <w:rFonts w:eastAsia="Calibri" w:cs="Calibri" w:ascii="Calibri" w:hAnsi="Calibri"/>
+                <w:b/>
+              </w:rPr>
             </w:r>
           </w:p>
           <w:p>
@@ -2186,7 +3254,7 @@
                 <w:sz w:val="22"/>
                 <w:szCs w:val="22"/>
               </w:rPr>
-              <w:t xml:space="preserve">. " O'Reilly Media, Inc.".  </w:t>
+              <w:t>. " O'Reilly Media, Inc.".</w:t>
             </w:r>
           </w:p>
           <w:p>
@@ -2199,7 +3267,10 @@
               </w:rPr>
             </w:pPr>
             <w:r>
-              <w:rPr/>
+              <w:rPr>
+                <w:rFonts w:eastAsia="Calibri" w:cs="Calibri" w:ascii="Calibri" w:hAnsi="Calibri"/>
+                <w:b/>
+              </w:rPr>
             </w:r>
           </w:p>
           <w:p>
@@ -5504,13 +6575,13 @@
       </w:tblPr>
       <w:tblGrid>
         <w:gridCol w:w="289"/>
-        <w:gridCol w:w="3258"/>
-        <w:gridCol w:w="285"/>
+        <w:gridCol w:w="3257"/>
+        <w:gridCol w:w="286"/>
         <w:gridCol w:w="709"/>
         <w:gridCol w:w="942"/>
         <w:gridCol w:w="1469"/>
-        <w:gridCol w:w="284"/>
-        <w:gridCol w:w="2974"/>
+        <w:gridCol w:w="285"/>
+        <w:gridCol w:w="2973"/>
         <w:gridCol w:w="345"/>
       </w:tblGrid>
       <w:tr>
@@ -5761,7 +6832,62 @@
         </w:tc>
         <w:tc>
           <w:tcPr>
-            <w:tcW w:w="3258" w:type="dxa"/>
+            <w:tcW w:w="3257" w:type="dxa"/>
+            <w:tcBorders>
+              <w:bottom w:val="single" w:sz="4" w:space="0" w:color="7F7F7F"/>
+            </w:tcBorders>
+            <w:shd w:fill="auto" w:val="clear"/>
+            <w:vAlign w:val="bottom"/>
+          </w:tcPr>
+          <w:p>
+            <w:pPr>
+              <w:pStyle w:val="Normal1"/>
+              <w:jc w:val="both"/>
+              <w:rPr>
+                <w:rFonts w:ascii="Calibri" w:hAnsi="Calibri" w:eastAsia="Calibri" w:cs="Calibri"/>
+                <w:sz w:val="22"/>
+                <w:szCs w:val="22"/>
+              </w:rPr>
+            </w:pPr>
+            <w:r>
+              <w:rPr>
+                <w:rFonts w:eastAsia="Calibri" w:cs="Calibri" w:ascii="Calibri" w:hAnsi="Calibri"/>
+                <w:sz w:val="22"/>
+                <w:szCs w:val="22"/>
+              </w:rPr>
+            </w:r>
+          </w:p>
+        </w:tc>
+        <w:tc>
+          <w:tcPr>
+            <w:tcW w:w="286" w:type="dxa"/>
+            <w:tcBorders/>
+            <w:shd w:fill="auto" w:val="clear"/>
+            <w:vAlign w:val="bottom"/>
+          </w:tcPr>
+          <w:p>
+            <w:pPr>
+              <w:pStyle w:val="Normal1"/>
+              <w:jc w:val="both"/>
+              <w:rPr>
+                <w:rFonts w:ascii="Calibri" w:hAnsi="Calibri" w:eastAsia="Calibri" w:cs="Calibri"/>
+                <w:sz w:val="22"/>
+                <w:szCs w:val="22"/>
+              </w:rPr>
+            </w:pPr>
+            <w:r>
+              <w:rPr>
+                <w:rFonts w:eastAsia="Calibri" w:cs="Calibri" w:ascii="Calibri" w:hAnsi="Calibri"/>
+                <w:sz w:val="22"/>
+                <w:szCs w:val="22"/>
+              </w:rPr>
+            </w:r>
+          </w:p>
+        </w:tc>
+        <w:tc>
+          <w:tcPr>
+            <w:tcW w:w="3120" w:type="dxa"/>
+            <w:gridSpan w:val="3"/>
             <w:tcBorders>
               <w:bottom w:val="single" w:sz="4" w:space="0" w:color="7F7F7F"/>
             </w:tcBorders>
@@ -5815,62 +6941,7 @@
         </w:tc>
         <w:tc>
           <w:tcPr>
-            <w:tcW w:w="3120" w:type="dxa"/>
-            <w:gridSpan w:val="3"/>
-            <w:tcBorders>
-              <w:bottom w:val="single" w:sz="4" w:space="0" w:color="7F7F7F"/>
-            </w:tcBorders>
-            <w:shd w:fill="auto" w:val="clear"/>
-            <w:vAlign w:val="bottom"/>
-          </w:tcPr>
-          <w:p>
-            <w:pPr>
-              <w:pStyle w:val="Normal1"/>
-              <w:jc w:val="both"/>
-              <w:rPr>
-                <w:rFonts w:ascii="Calibri" w:hAnsi="Calibri" w:eastAsia="Calibri" w:cs="Calibri"/>
-                <w:sz w:val="22"/>
-                <w:szCs w:val="22"/>
-              </w:rPr>
-            </w:pPr>
-            <w:r>
-              <w:rPr>
-                <w:rFonts w:eastAsia="Calibri" w:cs="Calibri" w:ascii="Calibri" w:hAnsi="Calibri"/>
-                <w:sz w:val="22"/>
-                <w:szCs w:val="22"/>
-              </w:rPr>
-            </w:r>
-          </w:p>
-        </w:tc>
-        <w:tc>
-          <w:tcPr>
-            <w:tcW w:w="284" w:type="dxa"/>
-            <w:tcBorders/>
-            <w:shd w:fill="auto" w:val="clear"/>
-            <w:vAlign w:val="bottom"/>
-          </w:tcPr>
-          <w:p>
-            <w:pPr>
-              <w:pStyle w:val="Normal1"/>
-              <w:jc w:val="both"/>
-              <w:rPr>
-                <w:rFonts w:ascii="Calibri" w:hAnsi="Calibri" w:eastAsia="Calibri" w:cs="Calibri"/>
-                <w:sz w:val="22"/>
-                <w:szCs w:val="22"/>
-              </w:rPr>
-            </w:pPr>
-            <w:r>
-              <w:rPr>
-                <w:rFonts w:eastAsia="Calibri" w:cs="Calibri" w:ascii="Calibri" w:hAnsi="Calibri"/>
-                <w:sz w:val="22"/>
-                <w:szCs w:val="22"/>
-              </w:rPr>
-            </w:r>
-          </w:p>
-        </w:tc>
-        <w:tc>
-          <w:tcPr>
-            <w:tcW w:w="2974" w:type="dxa"/>
+            <w:tcW w:w="2973" w:type="dxa"/>
             <w:tcBorders>
               <w:bottom w:val="single" w:sz="4" w:space="0" w:color="7F7F7F"/>
             </w:tcBorders>
@@ -5954,7 +7025,7 @@
         </w:tc>
         <w:tc>
           <w:tcPr>
-            <w:tcW w:w="3258" w:type="dxa"/>
+            <w:tcW w:w="3257" w:type="dxa"/>
             <w:tcBorders>
               <w:top w:val="single" w:sz="4" w:space="0" w:color="7F7F7F"/>
             </w:tcBorders>
@@ -5980,6 +7051,66 @@
                 <w:szCs w:val="22"/>
               </w:rPr>
               <w:t>Nombre Completo Secretario del Consejo de la Unidad Académica</w:t>
+            </w:r>
+          </w:p>
+        </w:tc>
+        <w:tc>
+          <w:tcPr>
+            <w:tcW w:w="286" w:type="dxa"/>
+            <w:tcBorders/>
+            <w:shd w:fill="auto" w:val="clear"/>
+            <w:vAlign w:val="bottom"/>
+          </w:tcPr>
+          <w:p>
+            <w:pPr>
+              <w:pStyle w:val="Normal1"/>
+              <w:jc w:val="center"/>
+              <w:rPr>
+                <w:rFonts w:ascii="Calibri" w:hAnsi="Calibri" w:eastAsia="Calibri" w:cs="Calibri"/>
+                <w:b/>
+                <w:sz w:val="22"/>
+                <w:szCs w:val="22"/>
+              </w:rPr>
+            </w:pPr>
+            <w:r>
+              <w:rPr>
+                <w:rFonts w:eastAsia="Calibri" w:cs="Calibri" w:ascii="Calibri" w:hAnsi="Calibri"/>
+                <w:b/>
+                <w:sz w:val="22"/>
+                <w:szCs w:val="22"/>
+              </w:rPr>
+            </w:r>
+          </w:p>
+        </w:tc>
+        <w:tc>
+          <w:tcPr>
+            <w:tcW w:w="3120" w:type="dxa"/>
+            <w:gridSpan w:val="3"/>
+            <w:tcBorders>
+              <w:top w:val="single" w:sz="4" w:space="0" w:color="7F7F7F"/>
+            </w:tcBorders>
+            <w:shd w:fill="auto" w:val="clear"/>
+            <w:vAlign w:val="bottom"/>
+          </w:tcPr>
+          <w:p>
+            <w:pPr>
+              <w:pStyle w:val="Normal1"/>
+              <w:jc w:val="center"/>
+              <w:rPr>
+                <w:rFonts w:ascii="Calibri" w:hAnsi="Calibri" w:eastAsia="Calibri" w:cs="Calibri"/>
+                <w:b/>
+                <w:sz w:val="22"/>
+                <w:szCs w:val="22"/>
+              </w:rPr>
+            </w:pPr>
+            <w:r>
+              <w:rPr>
+                <w:rFonts w:eastAsia="Calibri" w:cs="Calibri" w:ascii="Calibri" w:hAnsi="Calibri"/>
+                <w:b/>
+                <w:sz w:val="22"/>
+                <w:szCs w:val="22"/>
+              </w:rPr>
+              <w:t>Firma</w:t>
             </w:r>
           </w:p>
         </w:tc>
@@ -6013,67 +7144,7 @@
         </w:tc>
         <w:tc>
           <w:tcPr>
-            <w:tcW w:w="3120" w:type="dxa"/>
-            <w:gridSpan w:val="3"/>
-            <w:tcBorders>
-              <w:top w:val="single" w:sz="4" w:space="0" w:color="7F7F7F"/>
-            </w:tcBorders>
-            <w:shd w:fill="auto" w:val="clear"/>
-            <w:vAlign w:val="bottom"/>
-          </w:tcPr>
-          <w:p>
-            <w:pPr>
-              <w:pStyle w:val="Normal1"/>
-              <w:jc w:val="center"/>
-              <w:rPr>
-                <w:rFonts w:ascii="Calibri" w:hAnsi="Calibri" w:eastAsia="Calibri" w:cs="Calibri"/>
-                <w:b/>
-                <w:sz w:val="22"/>
-                <w:szCs w:val="22"/>
-              </w:rPr>
-            </w:pPr>
-            <w:r>
-              <w:rPr>
-                <w:rFonts w:eastAsia="Calibri" w:cs="Calibri" w:ascii="Calibri" w:hAnsi="Calibri"/>
-                <w:b/>
-                <w:sz w:val="22"/>
-                <w:szCs w:val="22"/>
-              </w:rPr>
-              <w:t>Firma</w:t>
-            </w:r>
-          </w:p>
-        </w:tc>
-        <w:tc>
-          <w:tcPr>
-            <w:tcW w:w="284" w:type="dxa"/>
-            <w:tcBorders/>
-            <w:shd w:fill="auto" w:val="clear"/>
-            <w:vAlign w:val="bottom"/>
-          </w:tcPr>
-          <w:p>
-            <w:pPr>
-              <w:pStyle w:val="Normal1"/>
-              <w:jc w:val="center"/>
-              <w:rPr>
-                <w:rFonts w:ascii="Calibri" w:hAnsi="Calibri" w:eastAsia="Calibri" w:cs="Calibri"/>
-                <w:b/>
-                <w:sz w:val="22"/>
-                <w:szCs w:val="22"/>
-              </w:rPr>
-            </w:pPr>
-            <w:r>
-              <w:rPr>
-                <w:rFonts w:eastAsia="Calibri" w:cs="Calibri" w:ascii="Calibri" w:hAnsi="Calibri"/>
-                <w:b/>
-                <w:sz w:val="22"/>
-                <w:szCs w:val="22"/>
-              </w:rPr>
-            </w:r>
-          </w:p>
-        </w:tc>
-        <w:tc>
-          <w:tcPr>
-            <w:tcW w:w="2974" w:type="dxa"/>
+            <w:tcW w:w="2973" w:type="dxa"/>
             <w:tcBorders>
               <w:top w:val="single" w:sz="4" w:space="0" w:color="7F7F7F"/>
             </w:tcBorders>
@@ -6345,7 +7416,7 @@
     </w:r>
     <w:r>
       <w:rPr/>
-      <w:t>4</w:t>
+      <w:t>5</w:t>
     </w:r>
     <w:r>
       <w:rPr/>
@@ -6385,7 +7456,7 @@
     </w:r>
     <w:r>
       <w:rPr/>
-      <w:t>4</w:t>
+      <w:t>5</w:t>
     </w:r>
     <w:r>
       <w:rPr/>
@@ -6522,7 +7593,7 @@
     </w:r>
     <w:r>
       <w:rPr/>
-      <w:t>4</w:t>
+      <w:t>5</w:t>
     </w:r>
     <w:r>
       <w:rPr/>
@@ -6562,7 +7633,7 @@
     </w:r>
     <w:r>
       <w:rPr/>
-      <w:t>4</w:t>
+      <w:t>5</w:t>
     </w:r>
     <w:r>
       <w:rPr/>

</xml_diff>

<commit_message>
inicio de diseño de curso para virtualización
</commit_message>
<xml_diff>
--- a/promocion_investigacion_didactica_del_ml/virtualizacion_propuesta/PropuestasVirtualización_Marco.docx
+++ b/promocion_investigacion_didactica_del_ml/virtualizacion_propuesta/PropuestasVirtualización_Marco.docx
@@ -697,8 +697,8 @@
         <w:tblLook w:val="0600"/>
       </w:tblPr>
       <w:tblGrid>
-        <w:gridCol w:w="3050"/>
-        <w:gridCol w:w="3272"/>
+        <w:gridCol w:w="3049"/>
+        <w:gridCol w:w="3273"/>
         <w:gridCol w:w="4173"/>
       </w:tblGrid>
       <w:tr>
@@ -917,27 +917,22 @@
               </w:rPr>
               <w:t>Realizar una descripción general que considere el propósito del curso en coherencia con los objetivos de formación del programa académico.</w:t>
             </w:r>
-            <w:r>
-              <w:rPr>
-                <w:b/>
-                <w:color w:val="808080"/>
-                <w:sz w:val="22"/>
-                <w:szCs w:val="22"/>
-              </w:rPr>
-              <w:t xml:space="preserve">  </w:t>
-            </w:r>
-          </w:p>
-          <w:p>
-            <w:pPr>
-              <w:pStyle w:val="Normal1"/>
-              <w:rPr>
-                <w:b/>
-                <w:sz w:val="22"/>
-                <w:szCs w:val="22"/>
-              </w:rPr>
-            </w:pPr>
-            <w:r>
-              <w:rPr/>
+          </w:p>
+          <w:p>
+            <w:pPr>
+              <w:pStyle w:val="Normal1"/>
+              <w:rPr>
+                <w:b/>
+                <w:sz w:val="22"/>
+                <w:szCs w:val="22"/>
+              </w:rPr>
+            </w:pPr>
+            <w:r>
+              <w:rPr>
+                <w:b/>
+                <w:sz w:val="22"/>
+                <w:szCs w:val="22"/>
+              </w:rPr>
             </w:r>
           </w:p>
           <w:p>
@@ -969,7 +964,11 @@
               </w:rPr>
             </w:pPr>
             <w:r>
-              <w:rPr/>
+              <w:rPr>
+                <w:b/>
+                <w:sz w:val="22"/>
+                <w:szCs w:val="22"/>
+              </w:rPr>
             </w:r>
           </w:p>
           <w:p>
@@ -1020,7 +1019,11 @@
               </w:rPr>
             </w:pPr>
             <w:r>
-              <w:rPr/>
+              <w:rPr>
+                <w:b/>
+                <w:sz w:val="22"/>
+                <w:szCs w:val="22"/>
+              </w:rPr>
             </w:r>
           </w:p>
           <w:p>
@@ -1086,7 +1089,25 @@
                 <w:sz w:val="22"/>
                 <w:szCs w:val="22"/>
               </w:rPr>
-              <w:t>- Fundamentos de Python: variables, tipos de datos, estructuras de control.</w:t>
+              <w:t xml:space="preserve">- Fundamentos de Python: variables, tipos de datos, </w:t>
+            </w:r>
+            <w:r>
+              <w:rPr>
+                <w:b/>
+                <w:color w:val="808080"/>
+                <w:sz w:val="22"/>
+                <w:szCs w:val="22"/>
+              </w:rPr>
+              <w:t xml:space="preserve">estructuras de datos, </w:t>
+            </w:r>
+            <w:r>
+              <w:rPr>
+                <w:b/>
+                <w:color w:val="808080"/>
+                <w:sz w:val="22"/>
+                <w:szCs w:val="22"/>
+              </w:rPr>
+              <w:t>estructuras de control.</w:t>
             </w:r>
           </w:p>
           <w:p>
@@ -1114,7 +1135,25 @@
                 <w:sz w:val="22"/>
                 <w:szCs w:val="22"/>
               </w:rPr>
-              <w:t>- Bibliotecas para Ciencia de Datos en Python: NumPy, Pandas, Matplotlib.</w:t>
+              <w:t xml:space="preserve">- Bibliotecas para Ciencia de Datos en Python: NumPy, Pandas, Matplotlib </w:t>
+            </w:r>
+            <w:r>
+              <w:rPr>
+                <w:b/>
+                <w:color w:val="808080"/>
+                <w:sz w:val="22"/>
+                <w:szCs w:val="22"/>
+              </w:rPr>
+              <w:t>y plothy</w:t>
+            </w:r>
+            <w:r>
+              <w:rPr>
+                <w:b/>
+                <w:color w:val="808080"/>
+                <w:sz w:val="22"/>
+                <w:szCs w:val="22"/>
+              </w:rPr>
+              <w:t>.</w:t>
             </w:r>
           </w:p>
           <w:p>
@@ -1142,20 +1181,60 @@
                 <w:sz w:val="22"/>
                 <w:szCs w:val="22"/>
               </w:rPr>
-              <w:t>- Manipulación y visualización de datos con Pandas y Matplotlib.</w:t>
-            </w:r>
-          </w:p>
-          <w:p>
-            <w:pPr>
-              <w:pStyle w:val="Normal1"/>
-              <w:rPr>
-                <w:b/>
-                <w:sz w:val="22"/>
-                <w:szCs w:val="22"/>
-              </w:rPr>
-            </w:pPr>
-            <w:r>
-              <w:rPr/>
+              <w:t xml:space="preserve">- Manipulación y visualización de datos con Pandas, Matplotlib </w:t>
+            </w:r>
+            <w:r>
+              <w:rPr>
+                <w:b/>
+                <w:color w:val="808080"/>
+                <w:sz w:val="22"/>
+                <w:szCs w:val="22"/>
+              </w:rPr>
+              <w:t>y</w:t>
+            </w:r>
+            <w:r>
+              <w:rPr>
+                <w:b/>
+                <w:color w:val="808080"/>
+                <w:sz w:val="22"/>
+                <w:szCs w:val="22"/>
+              </w:rPr>
+              <w:t xml:space="preserve"> </w:t>
+            </w:r>
+            <w:r>
+              <w:rPr>
+                <w:b/>
+                <w:color w:val="808080"/>
+                <w:sz w:val="22"/>
+                <w:szCs w:val="22"/>
+              </w:rPr>
+              <w:t>plotly</w:t>
+            </w:r>
+            <w:r>
+              <w:rPr>
+                <w:b/>
+                <w:color w:val="808080"/>
+                <w:sz w:val="22"/>
+                <w:szCs w:val="22"/>
+              </w:rPr>
+              <w:t>.</w:t>
+            </w:r>
+          </w:p>
+          <w:p>
+            <w:pPr>
+              <w:pStyle w:val="Normal1"/>
+              <w:rPr>
+                <w:b/>
+                <w:sz w:val="22"/>
+                <w:szCs w:val="22"/>
+              </w:rPr>
+            </w:pPr>
+            <w:r>
+              <w:rPr>
+                <w:b/>
+                <w:sz w:val="22"/>
+                <w:szCs w:val="22"/>
+              </w:rPr>
             </w:r>
           </w:p>
           <w:p>
@@ -1258,20 +1337,42 @@
                 <w:sz w:val="22"/>
                 <w:szCs w:val="22"/>
               </w:rPr>
-              <w:t>- Inferencia estadística básica: intervalos de confianza, pruebas de hipótesis.</w:t>
-            </w:r>
-          </w:p>
-          <w:p>
-            <w:pPr>
-              <w:pStyle w:val="Normal1"/>
-              <w:rPr>
-                <w:b/>
-                <w:sz w:val="22"/>
-                <w:szCs w:val="22"/>
-              </w:rPr>
-            </w:pPr>
-            <w:r>
-              <w:rPr/>
+              <w:t xml:space="preserve">- </w:t>
+            </w:r>
+            <w:r>
+              <w:rPr>
+                <w:b/>
+                <w:color w:val="808080"/>
+                <w:sz w:val="22"/>
+                <w:szCs w:val="22"/>
+              </w:rPr>
+              <w:t>Establecimiento de correlaciones entre atributos</w:t>
+            </w:r>
+            <w:r>
+              <w:rPr>
+                <w:b/>
+                <w:color w:val="808080"/>
+                <w:sz w:val="22"/>
+                <w:szCs w:val="22"/>
+              </w:rPr>
+              <w:t>.</w:t>
+            </w:r>
+          </w:p>
+          <w:p>
+            <w:pPr>
+              <w:pStyle w:val="Normal1"/>
+              <w:rPr>
+                <w:b/>
+                <w:sz w:val="22"/>
+                <w:szCs w:val="22"/>
+              </w:rPr>
+            </w:pPr>
+            <w:r>
+              <w:rPr>
+                <w:b/>
+                <w:sz w:val="22"/>
+                <w:szCs w:val="22"/>
+              </w:rPr>
             </w:r>
           </w:p>
           <w:p>
@@ -1387,7 +1488,11 @@
               </w:rPr>
             </w:pPr>
             <w:r>
-              <w:rPr/>
+              <w:rPr>
+                <w:b/>
+                <w:sz w:val="22"/>
+                <w:szCs w:val="22"/>
+              </w:rPr>
             </w:r>
           </w:p>
           <w:p>
@@ -1462,7 +1567,25 @@
                 <w:sz w:val="22"/>
                 <w:szCs w:val="22"/>
               </w:rPr>
-              <w:t>- Algoritmos de clasificación: K-Nearest Neighbors, Árboles de Decisión, Random Forest.</w:t>
+              <w:t xml:space="preserve">- Algoritmos de clasificación: K-Nearest Neighbors, Árboles de Decisión, Random Forest, </w:t>
+            </w:r>
+            <w:r>
+              <w:rPr>
+                <w:b/>
+                <w:color w:val="808080"/>
+                <w:sz w:val="22"/>
+                <w:szCs w:val="22"/>
+              </w:rPr>
+              <w:t>máquinas de Soporte Vectorial</w:t>
+            </w:r>
+            <w:r>
+              <w:rPr>
+                <w:b/>
+                <w:color w:val="808080"/>
+                <w:sz w:val="22"/>
+                <w:szCs w:val="22"/>
+              </w:rPr>
+              <w:t>.</w:t>
             </w:r>
           </w:p>
           <w:p>
@@ -1503,7 +1626,11 @@
               </w:rPr>
             </w:pPr>
             <w:r>
-              <w:rPr/>
+              <w:rPr>
+                <w:b/>
+                <w:sz w:val="22"/>
+                <w:szCs w:val="22"/>
+              </w:rPr>
             </w:r>
           </w:p>
           <w:p>
@@ -1619,7 +1746,11 @@
               </w:rPr>
             </w:pPr>
             <w:r>
-              <w:rPr/>
+              <w:rPr>
+                <w:b/>
+                <w:sz w:val="22"/>
+                <w:szCs w:val="22"/>
+              </w:rPr>
             </w:r>
           </w:p>
           <w:p>
@@ -1670,7 +1801,11 @@
               </w:rPr>
             </w:pPr>
             <w:r>
-              <w:rPr/>
+              <w:rPr>
+                <w:b/>
+                <w:sz w:val="22"/>
+                <w:szCs w:val="22"/>
+              </w:rPr>
             </w:r>
           </w:p>
           <w:p>
@@ -1721,7 +1856,11 @@
               </w:rPr>
             </w:pPr>
             <w:r>
-              <w:rPr/>
+              <w:rPr>
+                <w:b/>
+                <w:sz w:val="22"/>
+                <w:szCs w:val="22"/>
+              </w:rPr>
             </w:r>
           </w:p>
           <w:p>
@@ -1772,7 +1911,11 @@
               </w:rPr>
             </w:pPr>
             <w:r>
-              <w:rPr/>
+              <w:rPr>
+                <w:b/>
+                <w:sz w:val="22"/>
+                <w:szCs w:val="22"/>
+              </w:rPr>
             </w:r>
           </w:p>
         </w:tc>
@@ -1874,18 +2017,20 @@
                 <w:sz w:val="22"/>
                 <w:szCs w:val="22"/>
               </w:rPr>
-              <w:t xml:space="preserve">.  </w:t>
-            </w:r>
-          </w:p>
-          <w:p>
-            <w:pPr>
-              <w:pStyle w:val="Normal1"/>
-              <w:rPr>
-                <w:rFonts w:ascii="Calibri" w:hAnsi="Calibri" w:eastAsia="Calibri" w:cs="Calibri"/>
-              </w:rPr>
-            </w:pPr>
-            <w:r>
-              <w:rPr/>
+              <w:t>.</w:t>
+            </w:r>
+          </w:p>
+          <w:p>
+            <w:pPr>
+              <w:pStyle w:val="Normal1"/>
+              <w:rPr>
+                <w:rFonts w:ascii="Calibri" w:hAnsi="Calibri" w:eastAsia="Calibri" w:cs="Calibri"/>
+              </w:rPr>
+            </w:pPr>
+            <w:r>
+              <w:rPr>
+                <w:rFonts w:eastAsia="Calibri" w:cs="Calibri" w:ascii="Calibri" w:hAnsi="Calibri"/>
+              </w:rPr>
             </w:r>
           </w:p>
           <w:p>
@@ -1913,7 +2058,9 @@
               </w:rPr>
             </w:pPr>
             <w:r>
-              <w:rPr/>
+              <w:rPr>
+                <w:rFonts w:eastAsia="Calibri" w:cs="Calibri" w:ascii="Calibri" w:hAnsi="Calibri"/>
+              </w:rPr>
             </w:r>
           </w:p>
           <w:p>
@@ -1941,7 +2088,9 @@
               </w:rPr>
             </w:pPr>
             <w:r>
-              <w:rPr/>
+              <w:rPr>
+                <w:rFonts w:eastAsia="Calibri" w:cs="Calibri" w:ascii="Calibri" w:hAnsi="Calibri"/>
+              </w:rPr>
             </w:r>
           </w:p>
           <w:p>
@@ -1969,7 +2118,9 @@
               </w:rPr>
             </w:pPr>
             <w:r>
-              <w:rPr/>
+              <w:rPr>
+                <w:rFonts w:eastAsia="Calibri" w:cs="Calibri" w:ascii="Calibri" w:hAnsi="Calibri"/>
+              </w:rPr>
             </w:r>
           </w:p>
           <w:p>
@@ -1997,7 +2148,9 @@
               </w:rPr>
             </w:pPr>
             <w:r>
-              <w:rPr/>
+              <w:rPr>
+                <w:rFonts w:eastAsia="Calibri" w:cs="Calibri" w:ascii="Calibri" w:hAnsi="Calibri"/>
+              </w:rPr>
             </w:r>
           </w:p>
           <w:p>
@@ -2025,7 +2178,9 @@
               </w:rPr>
             </w:pPr>
             <w:r>
-              <w:rPr/>
+              <w:rPr>
+                <w:rFonts w:eastAsia="Calibri" w:cs="Calibri" w:ascii="Calibri" w:hAnsi="Calibri"/>
+              </w:rPr>
             </w:r>
           </w:p>
           <w:p>
@@ -2053,7 +2208,9 @@
               </w:rPr>
             </w:pPr>
             <w:r>
-              <w:rPr/>
+              <w:rPr>
+                <w:rFonts w:eastAsia="Calibri" w:cs="Calibri" w:ascii="Calibri" w:hAnsi="Calibri"/>
+              </w:rPr>
             </w:r>
           </w:p>
           <w:p>
@@ -2081,7 +2238,9 @@
               </w:rPr>
             </w:pPr>
             <w:r>
-              <w:rPr/>
+              <w:rPr>
+                <w:rFonts w:eastAsia="Calibri" w:cs="Calibri" w:ascii="Calibri" w:hAnsi="Calibri"/>
+              </w:rPr>
             </w:r>
           </w:p>
           <w:p>
@@ -2153,29 +2312,155 @@
                 <w:sz w:val="22"/>
                 <w:szCs w:val="22"/>
               </w:rPr>
-              <w:t xml:space="preserve">Escribir el objetivo general o el propósito principal del curso. En caso de que el curso esté definido por competencias, se describirán las competencias generales.  </w:t>
-            </w:r>
-          </w:p>
-          <w:p>
-            <w:pPr>
-              <w:pStyle w:val="Normal1"/>
-              <w:rPr>
-                <w:rFonts w:ascii="Calibri" w:hAnsi="Calibri" w:eastAsia="Calibri" w:cs="Calibri"/>
-              </w:rPr>
-            </w:pPr>
-            <w:r>
-              <w:rPr/>
-            </w:r>
-          </w:p>
-          <w:p>
-            <w:pPr>
-              <w:pStyle w:val="Normal1"/>
-              <w:rPr>
-                <w:rFonts w:ascii="Calibri" w:hAnsi="Calibri" w:eastAsia="Calibri" w:cs="Calibri"/>
-              </w:rPr>
-            </w:pPr>
-            <w:r>
-              <w:rPr/>
+              <w:t>Escribir el objetivo general o el propósito principal del curso. En caso de que el curso esté definido por competencias, se describirán las competencias generales.</w:t>
+            </w:r>
+          </w:p>
+          <w:p>
+            <w:pPr>
+              <w:pStyle w:val="Normal1"/>
+              <w:rPr>
+                <w:rFonts w:ascii="Calibri" w:hAnsi="Calibri" w:eastAsia="Calibri" w:cs="Calibri"/>
+              </w:rPr>
+            </w:pPr>
+            <w:r>
+              <w:rPr>
+                <w:rFonts w:eastAsia="Calibri" w:cs="Calibri" w:ascii="Calibri" w:hAnsi="Calibri"/>
+              </w:rPr>
+            </w:r>
+          </w:p>
+          <w:p>
+            <w:pPr>
+              <w:pStyle w:val="Normal1"/>
+              <w:rPr>
+                <w:rFonts w:ascii="Calibri" w:hAnsi="Calibri" w:eastAsia="Calibri" w:cs="Calibri"/>
+              </w:rPr>
+            </w:pPr>
+            <w:r>
+              <w:rPr>
+                <w:rFonts w:eastAsia="Calibri" w:cs="Calibri" w:ascii="Calibri" w:hAnsi="Calibri"/>
+              </w:rPr>
+              <w:t>El objetivo general de aprendizaje para este curso de Introducción al Machine Learning con Python podría ser:</w:t>
+            </w:r>
+          </w:p>
+          <w:p>
+            <w:pPr>
+              <w:pStyle w:val="Normal1"/>
+              <w:rPr>
+                <w:rFonts w:ascii="Calibri" w:hAnsi="Calibri" w:eastAsia="Calibri" w:cs="Calibri"/>
+              </w:rPr>
+            </w:pPr>
+            <w:r>
+              <w:rPr>
+                <w:rFonts w:eastAsia="Calibri" w:cs="Calibri" w:ascii="Calibri" w:hAnsi="Calibri"/>
+              </w:rPr>
+            </w:r>
+          </w:p>
+          <w:p>
+            <w:pPr>
+              <w:pStyle w:val="Normal1"/>
+              <w:rPr>
+                <w:rFonts w:ascii="Calibri" w:hAnsi="Calibri" w:eastAsia="Calibri" w:cs="Calibri"/>
+              </w:rPr>
+            </w:pPr>
+            <w:r>
+              <w:rPr>
+                <w:rFonts w:eastAsia="Calibri" w:cs="Calibri" w:ascii="Calibri" w:hAnsi="Calibri"/>
+              </w:rPr>
+              <w:t>**Objetivo General:**</w:t>
+            </w:r>
+          </w:p>
+          <w:p>
+            <w:pPr>
+              <w:pStyle w:val="Normal1"/>
+              <w:rPr>
+                <w:rFonts w:ascii="Calibri" w:hAnsi="Calibri" w:eastAsia="Calibri" w:cs="Calibri"/>
+              </w:rPr>
+            </w:pPr>
+            <w:r>
+              <w:rPr>
+                <w:rFonts w:eastAsia="Calibri" w:cs="Calibri" w:ascii="Calibri" w:hAnsi="Calibri"/>
+              </w:rPr>
+              <w:t>Al finalizar el curso, los participantes serán capaces de aplicar técnicas básicas de machine learning utilizando el lenguaje de programación Python y bibliotecas especializadas en ciencia de datos para analizar y modelar datos, así como evaluar la eficacia de los modelos generados.</w:t>
+            </w:r>
+          </w:p>
+          <w:p>
+            <w:pPr>
+              <w:pStyle w:val="Normal1"/>
+              <w:rPr>
+                <w:rFonts w:ascii="Calibri" w:hAnsi="Calibri" w:eastAsia="Calibri" w:cs="Calibri"/>
+              </w:rPr>
+            </w:pPr>
+            <w:r>
+              <w:rPr>
+                <w:rFonts w:eastAsia="Calibri" w:cs="Calibri" w:ascii="Calibri" w:hAnsi="Calibri"/>
+              </w:rPr>
+            </w:r>
+          </w:p>
+          <w:p>
+            <w:pPr>
+              <w:pStyle w:val="Normal1"/>
+              <w:rPr>
+                <w:rFonts w:ascii="Calibri" w:hAnsi="Calibri" w:eastAsia="Calibri" w:cs="Calibri"/>
+              </w:rPr>
+            </w:pPr>
+            <w:r>
+              <w:rPr>
+                <w:rFonts w:eastAsia="Calibri" w:cs="Calibri" w:ascii="Calibri" w:hAnsi="Calibri"/>
+              </w:rPr>
+              <w:t>Este objetivo general abarca la adquisición de habilidades fundamentales en el área de machine learning, desde el manejo básico de Python y sus bibliotecas para ciencia de datos, hasta la construcción y evaluación de modelos de regresión y clasificación. Además, el objetivo incluye la capacidad de aplicar estas técnicas a problemas del mundo real utilizando datos del proyecto investigativo Antioquia Mira Su Cielo.</w:t>
+            </w:r>
+          </w:p>
+          <w:p>
+            <w:pPr>
+              <w:pStyle w:val="Normal1"/>
+              <w:rPr>
+                <w:rFonts w:ascii="Calibri" w:hAnsi="Calibri" w:eastAsia="Calibri" w:cs="Calibri"/>
+              </w:rPr>
+            </w:pPr>
+            <w:r>
+              <w:rPr>
+                <w:rFonts w:eastAsia="Calibri" w:cs="Calibri" w:ascii="Calibri" w:hAnsi="Calibri"/>
+              </w:rPr>
+            </w:r>
+          </w:p>
+          <w:p>
+            <w:pPr>
+              <w:pStyle w:val="Normal1"/>
+              <w:rPr>
+                <w:rFonts w:ascii="Calibri" w:hAnsi="Calibri" w:eastAsia="Calibri" w:cs="Calibri"/>
+              </w:rPr>
+            </w:pPr>
+            <w:r>
+              <w:rPr>
+                <w:rFonts w:eastAsia="Calibri" w:cs="Calibri" w:ascii="Calibri" w:hAnsi="Calibri"/>
+              </w:rPr>
+              <w:t>Este objetivo general se alinea con la descripción y los contenidos del curso, así como con los requisitos y la metodología propuesta. Al alcanzar este objetivo, los participantes podrán obtener un certificado de finalización emitido por la Universidad de Antioquia, validando sus conocimientos y habilidades en el campo del machine learning con Python.</w:t>
+            </w:r>
+          </w:p>
+          <w:p>
+            <w:pPr>
+              <w:pStyle w:val="Normal1"/>
+              <w:rPr>
+                <w:rFonts w:ascii="Calibri" w:hAnsi="Calibri" w:eastAsia="Calibri" w:cs="Calibri"/>
+              </w:rPr>
+            </w:pPr>
+            <w:r>
+              <w:rPr>
+                <w:rFonts w:eastAsia="Calibri" w:cs="Calibri" w:ascii="Calibri" w:hAnsi="Calibri"/>
+              </w:rPr>
+            </w:r>
+          </w:p>
+          <w:p>
+            <w:pPr>
+              <w:pStyle w:val="Normal1"/>
+              <w:rPr>
+                <w:rFonts w:ascii="Calibri" w:hAnsi="Calibri" w:eastAsia="Calibri" w:cs="Calibri"/>
+              </w:rPr>
+            </w:pPr>
+            <w:r>
+              <w:rPr>
+                <w:rFonts w:eastAsia="Calibri" w:cs="Calibri" w:ascii="Calibri" w:hAnsi="Calibri"/>
+              </w:rPr>
             </w:r>
           </w:p>
         </w:tc>
@@ -2243,6 +2528,722 @@
               <w:jc w:val="both"/>
               <w:rPr>
                 <w:rFonts w:ascii="Calibri" w:hAnsi="Calibri" w:eastAsia="Calibri" w:cs="Calibri"/>
+                <w:sz w:val="22"/>
+                <w:szCs w:val="22"/>
+              </w:rPr>
+            </w:pPr>
+            <w:r>
+              <w:rPr/>
+            </w:r>
+          </w:p>
+          <w:p>
+            <w:pPr>
+              <w:pStyle w:val="Normal1"/>
+              <w:jc w:val="both"/>
+              <w:rPr>
+                <w:rFonts w:ascii="Calibri" w:hAnsi="Calibri" w:eastAsia="Calibri" w:cs="Calibri"/>
+                <w:sz w:val="22"/>
+                <w:szCs w:val="22"/>
+              </w:rPr>
+            </w:pPr>
+            <w:r>
+              <w:rPr>
+                <w:rFonts w:eastAsia="Calibri" w:cs="Calibri" w:ascii="Calibri" w:hAnsi="Calibri"/>
+                <w:color w:val="808080"/>
+                <w:sz w:val="22"/>
+                <w:szCs w:val="22"/>
+              </w:rPr>
+              <w:t>Aquí tienes una lista de objetivos específicos que ayudarán a alcanzar el objetivo general del curso:</w:t>
+            </w:r>
+          </w:p>
+          <w:p>
+            <w:pPr>
+              <w:pStyle w:val="Normal1"/>
+              <w:jc w:val="both"/>
+              <w:rPr>
+                <w:rFonts w:ascii="Calibri" w:hAnsi="Calibri" w:eastAsia="Calibri" w:cs="Calibri"/>
+                <w:sz w:val="22"/>
+                <w:szCs w:val="22"/>
+              </w:rPr>
+            </w:pPr>
+            <w:r>
+              <w:rPr/>
+            </w:r>
+          </w:p>
+          <w:p>
+            <w:pPr>
+              <w:pStyle w:val="Normal1"/>
+              <w:jc w:val="both"/>
+              <w:rPr>
+                <w:rFonts w:ascii="Calibri" w:hAnsi="Calibri" w:eastAsia="Calibri" w:cs="Calibri"/>
+                <w:sz w:val="22"/>
+                <w:szCs w:val="22"/>
+              </w:rPr>
+            </w:pPr>
+            <w:r>
+              <w:rPr>
+                <w:rFonts w:eastAsia="Calibri" w:cs="Calibri" w:ascii="Calibri" w:hAnsi="Calibri"/>
+                <w:color w:val="808080"/>
+                <w:sz w:val="22"/>
+                <w:szCs w:val="22"/>
+              </w:rPr>
+              <w:t>1. **Dominar los fundamentos de Python para Ciencia de Datos:**</w:t>
+            </w:r>
+          </w:p>
+          <w:p>
+            <w:pPr>
+              <w:pStyle w:val="Normal1"/>
+              <w:jc w:val="both"/>
+              <w:rPr>
+                <w:rFonts w:ascii="Calibri" w:hAnsi="Calibri" w:eastAsia="Calibri" w:cs="Calibri"/>
+                <w:sz w:val="22"/>
+                <w:szCs w:val="22"/>
+              </w:rPr>
+            </w:pPr>
+            <w:r>
+              <w:rPr>
+                <w:rFonts w:eastAsia="Calibri" w:cs="Calibri" w:ascii="Calibri" w:hAnsi="Calibri"/>
+                <w:color w:val="808080"/>
+                <w:sz w:val="22"/>
+                <w:szCs w:val="22"/>
+              </w:rPr>
+              <w:t xml:space="preserve">   </w:t>
+            </w:r>
+            <w:r>
+              <w:rPr>
+                <w:rFonts w:eastAsia="Calibri" w:cs="Calibri" w:ascii="Calibri" w:hAnsi="Calibri"/>
+                <w:color w:val="808080"/>
+                <w:sz w:val="22"/>
+                <w:szCs w:val="22"/>
+              </w:rPr>
+              <w:t>- Comprender y aplicar conceptos básicos de Python, como variables, tipos de datos y estructuras de control.</w:t>
+            </w:r>
+          </w:p>
+          <w:p>
+            <w:pPr>
+              <w:pStyle w:val="Normal1"/>
+              <w:jc w:val="both"/>
+              <w:rPr>
+                <w:rFonts w:ascii="Calibri" w:hAnsi="Calibri" w:eastAsia="Calibri" w:cs="Calibri"/>
+                <w:sz w:val="22"/>
+                <w:szCs w:val="22"/>
+              </w:rPr>
+            </w:pPr>
+            <w:r>
+              <w:rPr>
+                <w:rFonts w:eastAsia="Calibri" w:cs="Calibri" w:ascii="Calibri" w:hAnsi="Calibri"/>
+                <w:color w:val="808080"/>
+                <w:sz w:val="22"/>
+                <w:szCs w:val="22"/>
+              </w:rPr>
+              <w:t xml:space="preserve">   </w:t>
+            </w:r>
+            <w:r>
+              <w:rPr>
+                <w:rFonts w:eastAsia="Calibri" w:cs="Calibri" w:ascii="Calibri" w:hAnsi="Calibri"/>
+                <w:color w:val="808080"/>
+                <w:sz w:val="22"/>
+                <w:szCs w:val="22"/>
+              </w:rPr>
+              <w:t>- Utilizar eficazmente bibliotecas importantes para ciencia de datos, como NumPy, Pandas, Matplotlib y Plotly.</w:t>
+            </w:r>
+          </w:p>
+          <w:p>
+            <w:pPr>
+              <w:pStyle w:val="Normal1"/>
+              <w:jc w:val="both"/>
+              <w:rPr>
+                <w:rFonts w:ascii="Calibri" w:hAnsi="Calibri" w:eastAsia="Calibri" w:cs="Calibri"/>
+                <w:sz w:val="22"/>
+                <w:szCs w:val="22"/>
+              </w:rPr>
+            </w:pPr>
+            <w:r>
+              <w:rPr/>
+            </w:r>
+          </w:p>
+          <w:p>
+            <w:pPr>
+              <w:pStyle w:val="Normal1"/>
+              <w:jc w:val="both"/>
+              <w:rPr>
+                <w:rFonts w:ascii="Calibri" w:hAnsi="Calibri" w:eastAsia="Calibri" w:cs="Calibri"/>
+                <w:sz w:val="22"/>
+                <w:szCs w:val="22"/>
+              </w:rPr>
+            </w:pPr>
+            <w:r>
+              <w:rPr>
+                <w:rFonts w:eastAsia="Calibri" w:cs="Calibri" w:ascii="Calibri" w:hAnsi="Calibri"/>
+                <w:color w:val="808080"/>
+                <w:sz w:val="22"/>
+                <w:szCs w:val="22"/>
+              </w:rPr>
+              <w:t>2. **Entender los Elementos Básicos de Estadística para Ciencia de Datos:**</w:t>
+            </w:r>
+          </w:p>
+          <w:p>
+            <w:pPr>
+              <w:pStyle w:val="Normal1"/>
+              <w:jc w:val="both"/>
+              <w:rPr>
+                <w:rFonts w:ascii="Calibri" w:hAnsi="Calibri" w:eastAsia="Calibri" w:cs="Calibri"/>
+                <w:sz w:val="22"/>
+                <w:szCs w:val="22"/>
+              </w:rPr>
+            </w:pPr>
+            <w:r>
+              <w:rPr>
+                <w:rFonts w:eastAsia="Calibri" w:cs="Calibri" w:ascii="Calibri" w:hAnsi="Calibri"/>
+                <w:color w:val="808080"/>
+                <w:sz w:val="22"/>
+                <w:szCs w:val="22"/>
+              </w:rPr>
+              <w:t xml:space="preserve">   </w:t>
+            </w:r>
+            <w:r>
+              <w:rPr>
+                <w:rFonts w:eastAsia="Calibri" w:cs="Calibri" w:ascii="Calibri" w:hAnsi="Calibri"/>
+                <w:color w:val="808080"/>
+                <w:sz w:val="22"/>
+                <w:szCs w:val="22"/>
+              </w:rPr>
+              <w:t>- Describir y calcular medidas de tendencia central, dispersión y distribución.</w:t>
+            </w:r>
+          </w:p>
+          <w:p>
+            <w:pPr>
+              <w:pStyle w:val="Normal1"/>
+              <w:jc w:val="both"/>
+              <w:rPr>
+                <w:rFonts w:ascii="Calibri" w:hAnsi="Calibri" w:eastAsia="Calibri" w:cs="Calibri"/>
+                <w:sz w:val="22"/>
+                <w:szCs w:val="22"/>
+              </w:rPr>
+            </w:pPr>
+            <w:r>
+              <w:rPr>
+                <w:rFonts w:eastAsia="Calibri" w:cs="Calibri" w:ascii="Calibri" w:hAnsi="Calibri"/>
+                <w:color w:val="808080"/>
+                <w:sz w:val="22"/>
+                <w:szCs w:val="22"/>
+              </w:rPr>
+              <w:t xml:space="preserve">   </w:t>
+            </w:r>
+            <w:r>
+              <w:rPr>
+                <w:rFonts w:eastAsia="Calibri" w:cs="Calibri" w:ascii="Calibri" w:hAnsi="Calibri"/>
+                <w:color w:val="808080"/>
+                <w:sz w:val="22"/>
+                <w:szCs w:val="22"/>
+              </w:rPr>
+              <w:t>- Interpretar y utilizar conceptos de probabilidad y distribuciones de probabilidad.</w:t>
+            </w:r>
+          </w:p>
+          <w:p>
+            <w:pPr>
+              <w:pStyle w:val="Normal1"/>
+              <w:jc w:val="both"/>
+              <w:rPr>
+                <w:rFonts w:ascii="Calibri" w:hAnsi="Calibri" w:eastAsia="Calibri" w:cs="Calibri"/>
+                <w:sz w:val="22"/>
+                <w:szCs w:val="22"/>
+              </w:rPr>
+            </w:pPr>
+            <w:r>
+              <w:rPr>
+                <w:rFonts w:eastAsia="Calibri" w:cs="Calibri" w:ascii="Calibri" w:hAnsi="Calibri"/>
+                <w:color w:val="808080"/>
+                <w:sz w:val="22"/>
+                <w:szCs w:val="22"/>
+              </w:rPr>
+              <w:t xml:space="preserve">   </w:t>
+            </w:r>
+            <w:r>
+              <w:rPr>
+                <w:rFonts w:eastAsia="Calibri" w:cs="Calibri" w:ascii="Calibri" w:hAnsi="Calibri"/>
+                <w:color w:val="808080"/>
+                <w:sz w:val="22"/>
+                <w:szCs w:val="22"/>
+              </w:rPr>
+              <w:t>- Identificar y establecer correlaciones entre atributos en conjuntos de datos.</w:t>
+            </w:r>
+          </w:p>
+          <w:p>
+            <w:pPr>
+              <w:pStyle w:val="Normal1"/>
+              <w:jc w:val="both"/>
+              <w:rPr>
+                <w:rFonts w:ascii="Calibri" w:hAnsi="Calibri" w:eastAsia="Calibri" w:cs="Calibri"/>
+                <w:sz w:val="22"/>
+                <w:szCs w:val="22"/>
+              </w:rPr>
+            </w:pPr>
+            <w:r>
+              <w:rPr/>
+            </w:r>
+          </w:p>
+          <w:p>
+            <w:pPr>
+              <w:pStyle w:val="Normal1"/>
+              <w:jc w:val="both"/>
+              <w:rPr>
+                <w:rFonts w:ascii="Calibri" w:hAnsi="Calibri" w:eastAsia="Calibri" w:cs="Calibri"/>
+                <w:sz w:val="22"/>
+                <w:szCs w:val="22"/>
+              </w:rPr>
+            </w:pPr>
+            <w:r>
+              <w:rPr>
+                <w:rFonts w:eastAsia="Calibri" w:cs="Calibri" w:ascii="Calibri" w:hAnsi="Calibri"/>
+                <w:color w:val="808080"/>
+                <w:sz w:val="22"/>
+                <w:szCs w:val="22"/>
+              </w:rPr>
+              <w:t>3. **Construir y Evaluar Modelos de Regresión:**</w:t>
+            </w:r>
+          </w:p>
+          <w:p>
+            <w:pPr>
+              <w:pStyle w:val="Normal1"/>
+              <w:jc w:val="both"/>
+              <w:rPr>
+                <w:rFonts w:ascii="Calibri" w:hAnsi="Calibri" w:eastAsia="Calibri" w:cs="Calibri"/>
+                <w:sz w:val="22"/>
+                <w:szCs w:val="22"/>
+              </w:rPr>
+            </w:pPr>
+            <w:r>
+              <w:rPr>
+                <w:rFonts w:eastAsia="Calibri" w:cs="Calibri" w:ascii="Calibri" w:hAnsi="Calibri"/>
+                <w:color w:val="808080"/>
+                <w:sz w:val="22"/>
+                <w:szCs w:val="22"/>
+              </w:rPr>
+              <w:t xml:space="preserve">   </w:t>
+            </w:r>
+            <w:r>
+              <w:rPr>
+                <w:rFonts w:eastAsia="Calibri" w:cs="Calibri" w:ascii="Calibri" w:hAnsi="Calibri"/>
+                <w:color w:val="808080"/>
+                <w:sz w:val="22"/>
+                <w:szCs w:val="22"/>
+              </w:rPr>
+              <w:t>- Conocer los conceptos básicos de regresión y su aplicación en la predicción de variables numéricas.</w:t>
+            </w:r>
+          </w:p>
+          <w:p>
+            <w:pPr>
+              <w:pStyle w:val="Normal1"/>
+              <w:jc w:val="both"/>
+              <w:rPr>
+                <w:rFonts w:ascii="Calibri" w:hAnsi="Calibri" w:eastAsia="Calibri" w:cs="Calibri"/>
+                <w:sz w:val="22"/>
+                <w:szCs w:val="22"/>
+              </w:rPr>
+            </w:pPr>
+            <w:r>
+              <w:rPr>
+                <w:rFonts w:eastAsia="Calibri" w:cs="Calibri" w:ascii="Calibri" w:hAnsi="Calibri"/>
+                <w:color w:val="808080"/>
+                <w:sz w:val="22"/>
+                <w:szCs w:val="22"/>
+              </w:rPr>
+              <w:t xml:space="preserve">   </w:t>
+            </w:r>
+            <w:r>
+              <w:rPr>
+                <w:rFonts w:eastAsia="Calibri" w:cs="Calibri" w:ascii="Calibri" w:hAnsi="Calibri"/>
+                <w:color w:val="808080"/>
+                <w:sz w:val="22"/>
+                <w:szCs w:val="22"/>
+              </w:rPr>
+              <w:t>- Implementar modelos de regresión lineal y polinómica utilizando Python y evaluar su desempeño.</w:t>
+            </w:r>
+          </w:p>
+          <w:p>
+            <w:pPr>
+              <w:pStyle w:val="Normal1"/>
+              <w:jc w:val="both"/>
+              <w:rPr>
+                <w:rFonts w:ascii="Calibri" w:hAnsi="Calibri" w:eastAsia="Calibri" w:cs="Calibri"/>
+                <w:sz w:val="22"/>
+                <w:szCs w:val="22"/>
+              </w:rPr>
+            </w:pPr>
+            <w:r>
+              <w:rPr/>
+            </w:r>
+          </w:p>
+          <w:p>
+            <w:pPr>
+              <w:pStyle w:val="Normal1"/>
+              <w:jc w:val="both"/>
+              <w:rPr>
+                <w:rFonts w:ascii="Calibri" w:hAnsi="Calibri" w:eastAsia="Calibri" w:cs="Calibri"/>
+                <w:sz w:val="22"/>
+                <w:szCs w:val="22"/>
+              </w:rPr>
+            </w:pPr>
+            <w:r>
+              <w:rPr>
+                <w:rFonts w:eastAsia="Calibri" w:cs="Calibri" w:ascii="Calibri" w:hAnsi="Calibri"/>
+                <w:color w:val="808080"/>
+                <w:sz w:val="22"/>
+                <w:szCs w:val="22"/>
+              </w:rPr>
+              <w:t>4. **Desarrollar y Evaluar Modelos de Clasificación:**</w:t>
+            </w:r>
+          </w:p>
+          <w:p>
+            <w:pPr>
+              <w:pStyle w:val="Normal1"/>
+              <w:jc w:val="both"/>
+              <w:rPr>
+                <w:rFonts w:ascii="Calibri" w:hAnsi="Calibri" w:eastAsia="Calibri" w:cs="Calibri"/>
+                <w:sz w:val="22"/>
+                <w:szCs w:val="22"/>
+              </w:rPr>
+            </w:pPr>
+            <w:r>
+              <w:rPr>
+                <w:rFonts w:eastAsia="Calibri" w:cs="Calibri" w:ascii="Calibri" w:hAnsi="Calibri"/>
+                <w:color w:val="808080"/>
+                <w:sz w:val="22"/>
+                <w:szCs w:val="22"/>
+              </w:rPr>
+              <w:t xml:space="preserve">   </w:t>
+            </w:r>
+            <w:r>
+              <w:rPr>
+                <w:rFonts w:eastAsia="Calibri" w:cs="Calibri" w:ascii="Calibri" w:hAnsi="Calibri"/>
+                <w:color w:val="808080"/>
+                <w:sz w:val="22"/>
+                <w:szCs w:val="22"/>
+              </w:rPr>
+              <w:t>- Familiarizarse con los principios de la clasificación y su aplicación en la asignación de etiquetas a datos.</w:t>
+            </w:r>
+          </w:p>
+          <w:p>
+            <w:pPr>
+              <w:pStyle w:val="Normal1"/>
+              <w:jc w:val="both"/>
+              <w:rPr>
+                <w:rFonts w:ascii="Calibri" w:hAnsi="Calibri" w:eastAsia="Calibri" w:cs="Calibri"/>
+                <w:sz w:val="22"/>
+                <w:szCs w:val="22"/>
+              </w:rPr>
+            </w:pPr>
+            <w:r>
+              <w:rPr>
+                <w:rFonts w:eastAsia="Calibri" w:cs="Calibri" w:ascii="Calibri" w:hAnsi="Calibri"/>
+                <w:color w:val="808080"/>
+                <w:sz w:val="22"/>
+                <w:szCs w:val="22"/>
+              </w:rPr>
+              <w:t xml:space="preserve">   </w:t>
+            </w:r>
+            <w:r>
+              <w:rPr>
+                <w:rFonts w:eastAsia="Calibri" w:cs="Calibri" w:ascii="Calibri" w:hAnsi="Calibri"/>
+                <w:color w:val="808080"/>
+                <w:sz w:val="22"/>
+                <w:szCs w:val="22"/>
+              </w:rPr>
+              <w:t>- Utilizar algoritmos de clasificación como K-Nearest Neighbors, Árboles de Decisión, Random Forest y Máquinas de Soporte Vectorial.</w:t>
+            </w:r>
+          </w:p>
+          <w:p>
+            <w:pPr>
+              <w:pStyle w:val="Normal1"/>
+              <w:jc w:val="both"/>
+              <w:rPr>
+                <w:rFonts w:ascii="Calibri" w:hAnsi="Calibri" w:eastAsia="Calibri" w:cs="Calibri"/>
+                <w:sz w:val="22"/>
+                <w:szCs w:val="22"/>
+              </w:rPr>
+            </w:pPr>
+            <w:r>
+              <w:rPr>
+                <w:rFonts w:eastAsia="Calibri" w:cs="Calibri" w:ascii="Calibri" w:hAnsi="Calibri"/>
+                <w:color w:val="808080"/>
+                <w:sz w:val="22"/>
+                <w:szCs w:val="22"/>
+              </w:rPr>
+              <w:t xml:space="preserve">   </w:t>
+            </w:r>
+            <w:r>
+              <w:rPr>
+                <w:rFonts w:eastAsia="Calibri" w:cs="Calibri" w:ascii="Calibri" w:hAnsi="Calibri"/>
+                <w:color w:val="808080"/>
+                <w:sz w:val="22"/>
+                <w:szCs w:val="22"/>
+              </w:rPr>
+              <w:t>- Evaluar la precisión y eficacia de los modelos de clasificación generados.</w:t>
+            </w:r>
+          </w:p>
+          <w:p>
+            <w:pPr>
+              <w:pStyle w:val="Normal1"/>
+              <w:jc w:val="both"/>
+              <w:rPr>
+                <w:rFonts w:ascii="Calibri" w:hAnsi="Calibri" w:eastAsia="Calibri" w:cs="Calibri"/>
+                <w:sz w:val="22"/>
+                <w:szCs w:val="22"/>
+              </w:rPr>
+            </w:pPr>
+            <w:r>
+              <w:rPr/>
+            </w:r>
+          </w:p>
+          <w:p>
+            <w:pPr>
+              <w:pStyle w:val="Normal1"/>
+              <w:jc w:val="both"/>
+              <w:rPr>
+                <w:rFonts w:ascii="Calibri" w:hAnsi="Calibri" w:eastAsia="Calibri" w:cs="Calibri"/>
+                <w:sz w:val="22"/>
+                <w:szCs w:val="22"/>
+              </w:rPr>
+            </w:pPr>
+            <w:r>
+              <w:rPr>
+                <w:rFonts w:eastAsia="Calibri" w:cs="Calibri" w:ascii="Calibri" w:hAnsi="Calibri"/>
+                <w:color w:val="808080"/>
+                <w:sz w:val="22"/>
+                <w:szCs w:val="22"/>
+              </w:rPr>
+              <w:t>5. **Aplicar Técnicas de Machine Learning en un Contexto Práctico:**</w:t>
+            </w:r>
+          </w:p>
+          <w:p>
+            <w:pPr>
+              <w:pStyle w:val="Normal1"/>
+              <w:jc w:val="both"/>
+              <w:rPr>
+                <w:rFonts w:ascii="Calibri" w:hAnsi="Calibri" w:eastAsia="Calibri" w:cs="Calibri"/>
+                <w:sz w:val="22"/>
+                <w:szCs w:val="22"/>
+              </w:rPr>
+            </w:pPr>
+            <w:r>
+              <w:rPr>
+                <w:rFonts w:eastAsia="Calibri" w:cs="Calibri" w:ascii="Calibri" w:hAnsi="Calibri"/>
+                <w:color w:val="808080"/>
+                <w:sz w:val="22"/>
+                <w:szCs w:val="22"/>
+              </w:rPr>
+              <w:t xml:space="preserve">   </w:t>
+            </w:r>
+            <w:r>
+              <w:rPr>
+                <w:rFonts w:eastAsia="Calibri" w:cs="Calibri" w:ascii="Calibri" w:hAnsi="Calibri"/>
+                <w:color w:val="808080"/>
+                <w:sz w:val="22"/>
+                <w:szCs w:val="22"/>
+              </w:rPr>
+              <w:t>- Entender el proyecto Antioquia Mira Su Cielo y la relevancia de los datos meteorológicos para la predicción del clima.</w:t>
+            </w:r>
+          </w:p>
+          <w:p>
+            <w:pPr>
+              <w:pStyle w:val="Normal1"/>
+              <w:jc w:val="both"/>
+              <w:rPr>
+                <w:rFonts w:ascii="Calibri" w:hAnsi="Calibri" w:eastAsia="Calibri" w:cs="Calibri"/>
+                <w:sz w:val="22"/>
+                <w:szCs w:val="22"/>
+              </w:rPr>
+            </w:pPr>
+            <w:r>
+              <w:rPr>
+                <w:rFonts w:eastAsia="Calibri" w:cs="Calibri" w:ascii="Calibri" w:hAnsi="Calibri"/>
+                <w:color w:val="808080"/>
+                <w:sz w:val="22"/>
+                <w:szCs w:val="22"/>
+              </w:rPr>
+              <w:t xml:space="preserve">   </w:t>
+            </w:r>
+            <w:r>
+              <w:rPr>
+                <w:rFonts w:eastAsia="Calibri" w:cs="Calibri" w:ascii="Calibri" w:hAnsi="Calibri"/>
+                <w:color w:val="808080"/>
+                <w:sz w:val="22"/>
+                <w:szCs w:val="22"/>
+              </w:rPr>
+              <w:t>- Preparar, explorar y limpiar datos del proyecto utilizando técnicas de manipulación de datos en Python.</w:t>
+            </w:r>
+          </w:p>
+          <w:p>
+            <w:pPr>
+              <w:pStyle w:val="Normal1"/>
+              <w:jc w:val="both"/>
+              <w:rPr>
+                <w:rFonts w:ascii="Calibri" w:hAnsi="Calibri" w:eastAsia="Calibri" w:cs="Calibri"/>
+                <w:sz w:val="22"/>
+                <w:szCs w:val="22"/>
+              </w:rPr>
+            </w:pPr>
+            <w:r>
+              <w:rPr>
+                <w:rFonts w:eastAsia="Calibri" w:cs="Calibri" w:ascii="Calibri" w:hAnsi="Calibri"/>
+                <w:color w:val="808080"/>
+                <w:sz w:val="22"/>
+                <w:szCs w:val="22"/>
+              </w:rPr>
+              <w:t xml:space="preserve">   </w:t>
+            </w:r>
+            <w:r>
+              <w:rPr>
+                <w:rFonts w:eastAsia="Calibri" w:cs="Calibri" w:ascii="Calibri" w:hAnsi="Calibri"/>
+                <w:color w:val="808080"/>
+                <w:sz w:val="22"/>
+                <w:szCs w:val="22"/>
+              </w:rPr>
+              <w:t>- Construir y evaluar modelos predictivos utilizando técnicas de machine learning y validar su rendimiento con datos reales.</w:t>
+            </w:r>
+          </w:p>
+          <w:p>
+            <w:pPr>
+              <w:pStyle w:val="Normal1"/>
+              <w:jc w:val="both"/>
+              <w:rPr>
+                <w:rFonts w:ascii="Calibri" w:hAnsi="Calibri" w:eastAsia="Calibri" w:cs="Calibri"/>
+                <w:sz w:val="22"/>
+                <w:szCs w:val="22"/>
+              </w:rPr>
+            </w:pPr>
+            <w:r>
+              <w:rPr/>
+            </w:r>
+          </w:p>
+          <w:p>
+            <w:pPr>
+              <w:pStyle w:val="Normal1"/>
+              <w:jc w:val="both"/>
+              <w:rPr>
+                <w:rFonts w:ascii="Calibri" w:hAnsi="Calibri" w:eastAsia="Calibri" w:cs="Calibri"/>
+                <w:sz w:val="22"/>
+                <w:szCs w:val="22"/>
+              </w:rPr>
+            </w:pPr>
+            <w:r>
+              <w:rPr>
+                <w:rFonts w:eastAsia="Calibri" w:cs="Calibri" w:ascii="Calibri" w:hAnsi="Calibri"/>
+                <w:color w:val="808080"/>
+                <w:sz w:val="22"/>
+                <w:szCs w:val="22"/>
+              </w:rPr>
+              <w:t>6. **Fortalecer la Habilidad para Comunicar Resultados y Conclusiones:**</w:t>
+            </w:r>
+          </w:p>
+          <w:p>
+            <w:pPr>
+              <w:pStyle w:val="Normal1"/>
+              <w:jc w:val="both"/>
+              <w:rPr>
+                <w:rFonts w:ascii="Calibri" w:hAnsi="Calibri" w:eastAsia="Calibri" w:cs="Calibri"/>
+                <w:sz w:val="22"/>
+                <w:szCs w:val="22"/>
+              </w:rPr>
+            </w:pPr>
+            <w:r>
+              <w:rPr>
+                <w:rFonts w:eastAsia="Calibri" w:cs="Calibri" w:ascii="Calibri" w:hAnsi="Calibri"/>
+                <w:color w:val="808080"/>
+                <w:sz w:val="22"/>
+                <w:szCs w:val="22"/>
+              </w:rPr>
+              <w:t xml:space="preserve">   </w:t>
+            </w:r>
+            <w:r>
+              <w:rPr>
+                <w:rFonts w:eastAsia="Calibri" w:cs="Calibri" w:ascii="Calibri" w:hAnsi="Calibri"/>
+                <w:color w:val="808080"/>
+                <w:sz w:val="22"/>
+                <w:szCs w:val="22"/>
+              </w:rPr>
+              <w:t>- Presentar de manera clara y efectiva los resultados obtenidos a partir del análisis de datos y la construcción de modelos.</w:t>
+            </w:r>
+          </w:p>
+          <w:p>
+            <w:pPr>
+              <w:pStyle w:val="Normal1"/>
+              <w:jc w:val="both"/>
+              <w:rPr>
+                <w:rFonts w:ascii="Calibri" w:hAnsi="Calibri" w:eastAsia="Calibri" w:cs="Calibri"/>
+                <w:sz w:val="22"/>
+                <w:szCs w:val="22"/>
+              </w:rPr>
+            </w:pPr>
+            <w:r>
+              <w:rPr>
+                <w:rFonts w:eastAsia="Calibri" w:cs="Calibri" w:ascii="Calibri" w:hAnsi="Calibri"/>
+                <w:color w:val="808080"/>
+                <w:sz w:val="22"/>
+                <w:szCs w:val="22"/>
+              </w:rPr>
+              <w:t xml:space="preserve">   </w:t>
+            </w:r>
+            <w:r>
+              <w:rPr>
+                <w:rFonts w:eastAsia="Calibri" w:cs="Calibri" w:ascii="Calibri" w:hAnsi="Calibri"/>
+                <w:color w:val="808080"/>
+                <w:sz w:val="22"/>
+                <w:szCs w:val="22"/>
+              </w:rPr>
+              <w:t>- Interpretar y explicar las conclusiones derivadas de la evaluación de modelos y su aplicación en el contexto del proyecto Antioquia Mira Su Cielo.</w:t>
+            </w:r>
+          </w:p>
+          <w:p>
+            <w:pPr>
+              <w:pStyle w:val="Normal1"/>
+              <w:jc w:val="both"/>
+              <w:rPr>
+                <w:rFonts w:ascii="Calibri" w:hAnsi="Calibri" w:eastAsia="Calibri" w:cs="Calibri"/>
+                <w:sz w:val="22"/>
+                <w:szCs w:val="22"/>
+              </w:rPr>
+            </w:pPr>
+            <w:r>
+              <w:rPr>
+                <w:rFonts w:eastAsia="Calibri" w:cs="Calibri" w:ascii="Calibri" w:hAnsi="Calibri"/>
+                <w:color w:val="808080"/>
+                <w:sz w:val="22"/>
+                <w:szCs w:val="22"/>
+              </w:rPr>
+              <w:t xml:space="preserve">   </w:t>
+            </w:r>
+            <w:r>
+              <w:rPr>
+                <w:rFonts w:eastAsia="Calibri" w:cs="Calibri" w:ascii="Calibri" w:hAnsi="Calibri"/>
+                <w:color w:val="808080"/>
+                <w:sz w:val="22"/>
+                <w:szCs w:val="22"/>
+              </w:rPr>
+              <w:t>- Utilizar un lenguaje preciso y técnico para describir procesos y resultados en informes y presentaciones.</w:t>
+            </w:r>
+          </w:p>
+          <w:p>
+            <w:pPr>
+              <w:pStyle w:val="Normal1"/>
+              <w:jc w:val="both"/>
+              <w:rPr>
+                <w:rFonts w:ascii="Calibri" w:hAnsi="Calibri" w:eastAsia="Calibri" w:cs="Calibri"/>
+                <w:sz w:val="22"/>
+                <w:szCs w:val="22"/>
+              </w:rPr>
+            </w:pPr>
+            <w:r>
+              <w:rPr/>
+            </w:r>
+          </w:p>
+          <w:p>
+            <w:pPr>
+              <w:pStyle w:val="Normal1"/>
+              <w:jc w:val="both"/>
+              <w:rPr>
+                <w:rFonts w:ascii="Calibri" w:hAnsi="Calibri" w:eastAsia="Calibri" w:cs="Calibri"/>
                 <w:b/>
                 <w:sz w:val="22"/>
                 <w:szCs w:val="22"/>
@@ -2294,13 +3295,98 @@
               </w:rPr>
               <w:t xml:space="preserve">Público al que está dirigido: </w:t>
             </w:r>
-            <w:r>
-              <w:rPr>
-                <w:color w:val="808080"/>
-                <w:sz w:val="22"/>
-                <w:szCs w:val="22"/>
-              </w:rPr>
-              <w:t>¿Cuál es el perfil del estudiante?  ¿Debe tener algunas competencias previas? ¿Cuáles?</w:t>
+          </w:p>
+          <w:p>
+            <w:pPr>
+              <w:pStyle w:val="Normal1"/>
+              <w:rPr>
+                <w:color w:val="808080"/>
+                <w:sz w:val="22"/>
+                <w:szCs w:val="22"/>
+              </w:rPr>
+            </w:pPr>
+            <w:r>
+              <w:rPr>
+                <w:color w:val="808080"/>
+                <w:sz w:val="22"/>
+                <w:szCs w:val="22"/>
+              </w:rPr>
+              <w:t xml:space="preserve">¿Cuál es el perfil del estudiante?    </w:t>
+            </w:r>
+          </w:p>
+          <w:p>
+            <w:pPr>
+              <w:pStyle w:val="Normal1"/>
+              <w:rPr>
+                <w:color w:val="808080"/>
+                <w:sz w:val="22"/>
+                <w:szCs w:val="22"/>
+              </w:rPr>
+            </w:pPr>
+            <w:r>
+              <w:rPr/>
+            </w:r>
+          </w:p>
+          <w:p>
+            <w:pPr>
+              <w:pStyle w:val="Normal1"/>
+              <w:rPr>
+                <w:color w:val="808080"/>
+                <w:sz w:val="22"/>
+                <w:szCs w:val="22"/>
+              </w:rPr>
+            </w:pPr>
+            <w:r>
+              <w:rPr>
+                <w:color w:val="808080"/>
+                <w:sz w:val="22"/>
+                <w:szCs w:val="22"/>
+              </w:rPr>
+              <w:t xml:space="preserve">¿Debe tener algunas competencias previas?   </w:t>
+            </w:r>
+          </w:p>
+          <w:p>
+            <w:pPr>
+              <w:pStyle w:val="Normal1"/>
+              <w:rPr>
+                <w:color w:val="808080"/>
+                <w:sz w:val="22"/>
+                <w:szCs w:val="22"/>
+              </w:rPr>
+            </w:pPr>
+            <w:r>
+              <w:rPr/>
+            </w:r>
+          </w:p>
+          <w:p>
+            <w:pPr>
+              <w:pStyle w:val="Normal1"/>
+              <w:rPr>
+                <w:color w:val="808080"/>
+                <w:sz w:val="22"/>
+                <w:szCs w:val="22"/>
+              </w:rPr>
+            </w:pPr>
+            <w:r>
+              <w:rPr>
+                <w:color w:val="808080"/>
+                <w:sz w:val="22"/>
+                <w:szCs w:val="22"/>
+              </w:rPr>
+              <w:t xml:space="preserve">¿Cuáles?  </w:t>
+            </w:r>
+          </w:p>
+          <w:p>
+            <w:pPr>
+              <w:pStyle w:val="Normal1"/>
+              <w:rPr>
+                <w:color w:val="808080"/>
+                <w:sz w:val="22"/>
+                <w:szCs w:val="22"/>
+              </w:rPr>
+            </w:pPr>
+            <w:r>
+              <w:rPr/>
             </w:r>
           </w:p>
         </w:tc>
@@ -2420,7 +3506,7 @@
         </w:trPr>
         <w:tc>
           <w:tcPr>
-            <w:tcW w:w="3050" w:type="dxa"/>
+            <w:tcW w:w="3049" w:type="dxa"/>
             <w:tcBorders>
               <w:top w:val="single" w:sz="4" w:space="0" w:color="7F7F7F"/>
               <w:left w:val="single" w:sz="4" w:space="0" w:color="7F7F7F"/>
@@ -2450,7 +3536,7 @@
         </w:tc>
         <w:tc>
           <w:tcPr>
-            <w:tcW w:w="3272" w:type="dxa"/>
+            <w:tcW w:w="3273" w:type="dxa"/>
             <w:tcBorders>
               <w:top w:val="single" w:sz="4" w:space="0" w:color="7F7F7F"/>
               <w:left w:val="single" w:sz="4" w:space="0" w:color="7F7F7F"/>
@@ -3311,7 +4397,33 @@
                 <w:sz w:val="22"/>
                 <w:szCs w:val="22"/>
               </w:rPr>
-              <w:t>. " O'Reilly Media, Inc.".</w:t>
+              <w:t xml:space="preserve">. " O'Reilly Media, Inc.".  </w:t>
+            </w:r>
+          </w:p>
+          <w:p>
+            <w:pPr>
+              <w:pStyle w:val="Normal1"/>
+              <w:jc w:val="both"/>
+              <w:rPr>
+                <w:rFonts w:ascii="Calibri" w:hAnsi="Calibri" w:eastAsia="Calibri" w:cs="Calibri"/>
+                <w:b/>
+              </w:rPr>
+            </w:pPr>
+            <w:r>
+              <w:rPr/>
+            </w:r>
+          </w:p>
+          <w:p>
+            <w:pPr>
+              <w:pStyle w:val="Normal1"/>
+              <w:jc w:val="both"/>
+              <w:rPr>
+                <w:rFonts w:ascii="Calibri" w:hAnsi="Calibri" w:eastAsia="Calibri" w:cs="Calibri"/>
+                <w:b/>
+              </w:rPr>
+            </w:pPr>
+            <w:r>
+              <w:rPr/>
             </w:r>
           </w:p>
         </w:tc>
@@ -3373,8 +4485,8 @@
       </w:tblPr>
       <w:tblGrid>
         <w:gridCol w:w="3254"/>
-        <w:gridCol w:w="1695"/>
-        <w:gridCol w:w="2325"/>
+        <w:gridCol w:w="2014"/>
+        <w:gridCol w:w="2006"/>
         <w:gridCol w:w="1215"/>
         <w:gridCol w:w="1035"/>
         <w:gridCol w:w="960"/>
@@ -3492,7 +4604,7 @@
         </w:tc>
         <w:tc>
           <w:tcPr>
-            <w:tcW w:w="1695" w:type="dxa"/>
+            <w:tcW w:w="2014" w:type="dxa"/>
             <w:tcBorders>
               <w:top w:val="single" w:sz="4" w:space="0" w:color="7F7F7F"/>
               <w:left w:val="single" w:sz="4" w:space="0" w:color="7F7F7F"/>
@@ -3526,7 +4638,7 @@
         </w:tc>
         <w:tc>
           <w:tcPr>
-            <w:tcW w:w="2325" w:type="dxa"/>
+            <w:tcW w:w="2006" w:type="dxa"/>
             <w:tcBorders>
               <w:top w:val="single" w:sz="4" w:space="0" w:color="7F7F7F"/>
               <w:left w:val="single" w:sz="4" w:space="0" w:color="7F7F7F"/>
@@ -3691,7 +4803,7 @@
         </w:tc>
         <w:tc>
           <w:tcPr>
-            <w:tcW w:w="1695" w:type="dxa"/>
+            <w:tcW w:w="2014" w:type="dxa"/>
             <w:tcBorders>
               <w:top w:val="single" w:sz="4" w:space="0" w:color="7F7F7F"/>
               <w:left w:val="single" w:sz="4" w:space="0" w:color="7F7F7F"/>
@@ -3718,7 +4830,7 @@
         </w:tc>
         <w:tc>
           <w:tcPr>
-            <w:tcW w:w="2325" w:type="dxa"/>
+            <w:tcW w:w="2006" w:type="dxa"/>
             <w:tcBorders>
               <w:top w:val="single" w:sz="4" w:space="0" w:color="7F7F7F"/>
               <w:left w:val="single" w:sz="4" w:space="0" w:color="7F7F7F"/>
@@ -3865,7 +4977,7 @@
         </w:tc>
         <w:tc>
           <w:tcPr>
-            <w:tcW w:w="1695" w:type="dxa"/>
+            <w:tcW w:w="2014" w:type="dxa"/>
             <w:tcBorders>
               <w:top w:val="single" w:sz="4" w:space="0" w:color="7F7F7F"/>
               <w:left w:val="single" w:sz="4" w:space="0" w:color="7F7F7F"/>
@@ -3892,7 +5004,7 @@
         </w:tc>
         <w:tc>
           <w:tcPr>
-            <w:tcW w:w="2325" w:type="dxa"/>
+            <w:tcW w:w="2006" w:type="dxa"/>
             <w:tcBorders>
               <w:top w:val="single" w:sz="4" w:space="0" w:color="7F7F7F"/>
               <w:left w:val="single" w:sz="4" w:space="0" w:color="7F7F7F"/>
@@ -4039,7 +5151,7 @@
         </w:tc>
         <w:tc>
           <w:tcPr>
-            <w:tcW w:w="1695" w:type="dxa"/>
+            <w:tcW w:w="2014" w:type="dxa"/>
             <w:tcBorders>
               <w:top w:val="single" w:sz="4" w:space="0" w:color="7F7F7F"/>
               <w:left w:val="single" w:sz="4" w:space="0" w:color="7F7F7F"/>
@@ -4066,7 +5178,7 @@
         </w:tc>
         <w:tc>
           <w:tcPr>
-            <w:tcW w:w="2325" w:type="dxa"/>
+            <w:tcW w:w="2006" w:type="dxa"/>
             <w:tcBorders>
               <w:top w:val="single" w:sz="4" w:space="0" w:color="7F7F7F"/>
               <w:left w:val="single" w:sz="4" w:space="0" w:color="7F7F7F"/>
@@ -4213,7 +5325,7 @@
         </w:tc>
         <w:tc>
           <w:tcPr>
-            <w:tcW w:w="1695" w:type="dxa"/>
+            <w:tcW w:w="2014" w:type="dxa"/>
             <w:tcBorders>
               <w:top w:val="single" w:sz="4" w:space="0" w:color="7F7F7F"/>
               <w:left w:val="single" w:sz="4" w:space="0" w:color="7F7F7F"/>
@@ -4240,7 +5352,7 @@
         </w:tc>
         <w:tc>
           <w:tcPr>
-            <w:tcW w:w="2325" w:type="dxa"/>
+            <w:tcW w:w="2006" w:type="dxa"/>
             <w:tcBorders>
               <w:top w:val="single" w:sz="4" w:space="0" w:color="7F7F7F"/>
               <w:left w:val="single" w:sz="4" w:space="0" w:color="7F7F7F"/>
@@ -7416,7 +8528,7 @@
     </w:r>
     <w:r>
       <w:rPr/>
-      <w:t>5</w:t>
+      <w:t>7</w:t>
     </w:r>
     <w:r>
       <w:rPr/>
@@ -7456,7 +8568,7 @@
     </w:r>
     <w:r>
       <w:rPr/>
-      <w:t>5</w:t>
+      <w:t>7</w:t>
     </w:r>
     <w:r>
       <w:rPr/>
@@ -7593,7 +8705,7 @@
     </w:r>
     <w:r>
       <w:rPr/>
-      <w:t>5</w:t>
+      <w:t>7</w:t>
     </w:r>
     <w:r>
       <w:rPr/>
@@ -7633,7 +8745,7 @@
     </w:r>
     <w:r>
       <w:rPr/>
-      <w:t>5</w:t>
+      <w:t>7</w:t>
     </w:r>
     <w:r>
       <w:rPr/>
@@ -8512,6 +9624,29 @@
       <w:szCs w:val="48"/>
     </w:rPr>
   </w:style>
+  <w:style w:type="paragraph" w:styleId="TableContents">
+    <w:name w:val="Table Contents"/>
+    <w:basedOn w:val="Normal"/>
+    <w:qFormat/>
+    <w:pPr>
+      <w:widowControl w:val="false"/>
+      <w:suppressLineNumbers/>
+    </w:pPr>
+    <w:rPr/>
+  </w:style>
+  <w:style w:type="paragraph" w:styleId="TableHeading">
+    <w:name w:val="Table Heading"/>
+    <w:basedOn w:val="TableContents"/>
+    <w:qFormat/>
+    <w:pPr>
+      <w:suppressLineNumbers/>
+      <w:jc w:val="center"/>
+    </w:pPr>
+    <w:rPr>
+      <w:b/>
+      <w:bCs/>
+    </w:rPr>
+  </w:style>
   <w:style w:type="numbering" w:styleId="NoList" w:default="1">
     <w:name w:val="No List"/>
     <w:uiPriority w:val="99"/>

</xml_diff>

<commit_message>
mejor planeación de la unidad de estadística
</commit_message>
<xml_diff>
--- a/promocion_investigacion_didactica_del_ml/virtualizacion_propuesta/PropuestasVirtualización_Marco.docx
+++ b/promocion_investigacion_didactica_del_ml/virtualizacion_propuesta/PropuestasVirtualización_Marco.docx
@@ -4296,10 +4296,7 @@
               </w:rPr>
             </w:pPr>
             <w:r>
-              <w:rPr>
-                <w:rFonts w:eastAsia="Calibri" w:cs="Calibri" w:ascii="Calibri" w:hAnsi="Calibri"/>
-                <w:b/>
-              </w:rPr>
+              <w:rPr/>
             </w:r>
           </w:p>
           <w:p>
@@ -4319,6 +4316,176 @@
                 <w:sz w:val="22"/>
                 <w:szCs w:val="22"/>
               </w:rPr>
+              <w:t xml:space="preserve">1. Bibliografía para </w:t>
+            </w:r>
+            <w:r>
+              <w:rPr>
+                <w:rFonts w:eastAsia="Calibri" w:cs="Calibri" w:ascii="Calibri" w:hAnsi="Calibri"/>
+                <w:b/>
+                <w:color w:val="808080"/>
+                <w:sz w:val="22"/>
+                <w:szCs w:val="22"/>
+              </w:rPr>
+              <w:t>Unidad 1 sobre Introducción a Python para ciencia de datos:</w:t>
+            </w:r>
+          </w:p>
+          <w:p>
+            <w:pPr>
+              <w:pStyle w:val="Normal1"/>
+              <w:jc w:val="both"/>
+              <w:rPr>
+                <w:rFonts w:ascii="Calibri" w:hAnsi="Calibri" w:eastAsia="Calibri" w:cs="Calibri"/>
+                <w:b/>
+              </w:rPr>
+            </w:pPr>
+            <w:r>
+              <w:rPr/>
+            </w:r>
+          </w:p>
+          <w:p>
+            <w:pPr>
+              <w:pStyle w:val="Normal1"/>
+              <w:jc w:val="both"/>
+              <w:rPr>
+                <w:rFonts w:ascii="Calibri" w:hAnsi="Calibri" w:eastAsia="Calibri" w:cs="Calibri"/>
+                <w:b/>
+              </w:rPr>
+            </w:pPr>
+            <w:r>
+              <w:rPr>
+                <w:rFonts w:eastAsia="Calibri" w:cs="Calibri" w:ascii="Calibri" w:hAnsi="Calibri"/>
+                <w:b/>
+                <w:color w:val="808080"/>
+                <w:sz w:val="22"/>
+                <w:szCs w:val="22"/>
+              </w:rPr>
+              <w:t xml:space="preserve">McKinney, W. (2022). </w:t>
+            </w:r>
+            <w:r>
+              <w:rPr>
+                <w:rFonts w:eastAsia="Calibri" w:cs="Calibri" w:ascii="Calibri" w:hAnsi="Calibri"/>
+                <w:b/>
+                <w:i/>
+                <w:color w:val="808080"/>
+                <w:sz w:val="22"/>
+                <w:szCs w:val="22"/>
+              </w:rPr>
+              <w:t>Python for data analysis</w:t>
+            </w:r>
+            <w:r>
+              <w:rPr>
+                <w:rFonts w:eastAsia="Calibri" w:cs="Calibri" w:ascii="Calibri" w:hAnsi="Calibri"/>
+                <w:b/>
+                <w:color w:val="808080"/>
+                <w:sz w:val="22"/>
+                <w:szCs w:val="22"/>
+              </w:rPr>
+              <w:t>. " O'Reilly Media, Inc.".</w:t>
+            </w:r>
+          </w:p>
+          <w:p>
+            <w:pPr>
+              <w:pStyle w:val="Normal1"/>
+              <w:jc w:val="both"/>
+              <w:rPr>
+                <w:rFonts w:ascii="Calibri" w:hAnsi="Calibri" w:eastAsia="Calibri" w:cs="Calibri"/>
+                <w:b/>
+              </w:rPr>
+            </w:pPr>
+            <w:r>
+              <w:rPr/>
+            </w:r>
+          </w:p>
+          <w:p>
+            <w:pPr>
+              <w:pStyle w:val="Normal1"/>
+              <w:jc w:val="both"/>
+              <w:rPr>
+                <w:b/>
+                <w:bCs/>
+              </w:rPr>
+            </w:pPr>
+            <w:r>
+              <w:rPr>
+                <w:b/>
+                <w:bCs/>
+                <w:color w:val="808080"/>
+                <w:sz w:val="22"/>
+                <w:szCs w:val="22"/>
+              </w:rPr>
+              <w:t xml:space="preserve">3. Bibliografía para </w:t>
+            </w:r>
+            <w:r>
+              <w:rPr>
+                <w:b/>
+                <w:bCs/>
+                <w:color w:val="808080"/>
+                <w:sz w:val="22"/>
+                <w:szCs w:val="22"/>
+              </w:rPr>
+              <w:t xml:space="preserve">Unidad </w:t>
+            </w:r>
+            <w:r>
+              <w:rPr>
+                <w:b/>
+                <w:bCs/>
+                <w:color w:val="808080"/>
+                <w:sz w:val="22"/>
+                <w:szCs w:val="22"/>
+              </w:rPr>
+              <w:t>3</w:t>
+            </w:r>
+            <w:r>
+              <w:rPr>
+                <w:b/>
+                <w:bCs/>
+                <w:color w:val="808080"/>
+                <w:sz w:val="22"/>
+                <w:szCs w:val="22"/>
+              </w:rPr>
+              <w:t xml:space="preserve"> sobre </w:t>
+            </w:r>
+            <w:r>
+              <w:rPr>
+                <w:b/>
+                <w:bCs/>
+                <w:color w:val="808080"/>
+                <w:sz w:val="22"/>
+                <w:szCs w:val="22"/>
+              </w:rPr>
+              <w:t xml:space="preserve">Construcción de modelos de regresión con técnicas de Machine Learning: </w:t>
+            </w:r>
+          </w:p>
+          <w:p>
+            <w:pPr>
+              <w:pStyle w:val="Normal1"/>
+              <w:jc w:val="both"/>
+              <w:rPr>
+                <w:rFonts w:ascii="Calibri" w:hAnsi="Calibri" w:eastAsia="Calibri" w:cs="Calibri"/>
+                <w:b/>
+              </w:rPr>
+            </w:pPr>
+            <w:r>
+              <w:rPr/>
+            </w:r>
+          </w:p>
+          <w:p>
+            <w:pPr>
+              <w:pStyle w:val="Normal1"/>
+              <w:jc w:val="both"/>
+              <w:rPr>
+                <w:rFonts w:ascii="Calibri" w:hAnsi="Calibri" w:eastAsia="Calibri" w:cs="Calibri"/>
+                <w:b/>
+              </w:rPr>
+            </w:pPr>
+            <w:r>
+              <w:rPr>
+                <w:rFonts w:eastAsia="Calibri" w:cs="Calibri" w:ascii="Calibri" w:hAnsi="Calibri"/>
+                <w:b/>
+                <w:color w:val="808080"/>
+                <w:sz w:val="22"/>
+                <w:szCs w:val="22"/>
+              </w:rPr>
               <w:t xml:space="preserve">Géron, A. (2022). </w:t>
             </w:r>
             <w:r>
@@ -4340,7 +4507,17 @@
                 <w:sz w:val="22"/>
                 <w:szCs w:val="22"/>
               </w:rPr>
-              <w:t>. " O'Reilly Media, Inc.".</w:t>
+              <w:t xml:space="preserve">. " O'Reilly Media, Inc.". </w:t>
+            </w:r>
+            <w:r>
+              <w:rPr>
+                <w:rFonts w:eastAsia="Calibri" w:cs="Calibri" w:ascii="Calibri" w:hAnsi="Calibri"/>
+                <w:b/>
+                <w:color w:val="808080"/>
+                <w:sz w:val="22"/>
+                <w:szCs w:val="22"/>
+              </w:rPr>
+              <w:t xml:space="preserve">Capítulo 2. </w:t>
             </w:r>
           </w:p>
           <w:p>
@@ -4376,7 +4553,100 @@
                 <w:sz w:val="22"/>
                 <w:szCs w:val="22"/>
               </w:rPr>
-              <w:t xml:space="preserve">McKinney, W. (2022). </w:t>
+              <w:t xml:space="preserve">4. Bibliografía para </w:t>
+            </w:r>
+            <w:r>
+              <w:rPr>
+                <w:rFonts w:eastAsia="Calibri" w:cs="Calibri" w:ascii="Calibri" w:hAnsi="Calibri"/>
+                <w:b/>
+                <w:color w:val="808080"/>
+                <w:sz w:val="22"/>
+                <w:szCs w:val="22"/>
+              </w:rPr>
+              <w:t xml:space="preserve">Unidad </w:t>
+            </w:r>
+            <w:r>
+              <w:rPr>
+                <w:rFonts w:eastAsia="Calibri" w:cs="Calibri" w:ascii="Calibri" w:hAnsi="Calibri"/>
+                <w:b/>
+                <w:color w:val="808080"/>
+                <w:sz w:val="22"/>
+                <w:szCs w:val="22"/>
+              </w:rPr>
+              <w:t>4</w:t>
+            </w:r>
+            <w:r>
+              <w:rPr>
+                <w:rFonts w:eastAsia="Calibri" w:cs="Calibri" w:ascii="Calibri" w:hAnsi="Calibri"/>
+                <w:b/>
+                <w:color w:val="808080"/>
+                <w:sz w:val="22"/>
+                <w:szCs w:val="22"/>
+              </w:rPr>
+              <w:t xml:space="preserve"> sobre </w:t>
+            </w:r>
+            <w:r>
+              <w:rPr>
+                <w:rFonts w:eastAsia="Calibri" w:cs="Calibri" w:ascii="Calibri" w:hAnsi="Calibri"/>
+                <w:b/>
+                <w:color w:val="808080"/>
+                <w:sz w:val="22"/>
+                <w:szCs w:val="22"/>
+              </w:rPr>
+              <w:t>Construcción de modelos de Clasificación con técnicas de Machine Learning</w:t>
+            </w:r>
+            <w:r>
+              <w:rPr>
+                <w:rFonts w:eastAsia="Calibri" w:cs="Calibri" w:ascii="Calibri" w:hAnsi="Calibri"/>
+                <w:b/>
+                <w:color w:val="808080"/>
+                <w:sz w:val="22"/>
+                <w:szCs w:val="22"/>
+              </w:rPr>
+              <w:t>:</w:t>
+            </w:r>
+            <w:r>
+              <w:rPr>
+                <w:rFonts w:eastAsia="Calibri" w:cs="Calibri" w:ascii="Calibri" w:hAnsi="Calibri"/>
+                <w:b/>
+                <w:color w:val="808080"/>
+                <w:sz w:val="22"/>
+                <w:szCs w:val="22"/>
+              </w:rPr>
+              <w:t xml:space="preserve">  </w:t>
+            </w:r>
+          </w:p>
+          <w:p>
+            <w:pPr>
+              <w:pStyle w:val="Normal1"/>
+              <w:jc w:val="both"/>
+              <w:rPr>
+                <w:rFonts w:ascii="Calibri" w:hAnsi="Calibri" w:eastAsia="Calibri" w:cs="Calibri"/>
+                <w:b/>
+              </w:rPr>
+            </w:pPr>
+            <w:r>
+              <w:rPr/>
+            </w:r>
+          </w:p>
+          <w:p>
+            <w:pPr>
+              <w:pStyle w:val="Normal1"/>
+              <w:jc w:val="both"/>
+              <w:rPr>
+                <w:rFonts w:ascii="Calibri" w:hAnsi="Calibri" w:eastAsia="Calibri" w:cs="Calibri"/>
+                <w:b/>
+              </w:rPr>
+            </w:pPr>
+            <w:r>
+              <w:rPr>
+                <w:rFonts w:eastAsia="Calibri" w:cs="Calibri" w:ascii="Calibri" w:hAnsi="Calibri"/>
+                <w:b/>
+                <w:color w:val="808080"/>
+                <w:sz w:val="22"/>
+                <w:szCs w:val="22"/>
+              </w:rPr>
+              <w:t xml:space="preserve">Géron, A. (2022). </w:t>
             </w:r>
             <w:r>
               <w:rPr>
@@ -4387,17 +4657,27 @@
                 <w:sz w:val="22"/>
                 <w:szCs w:val="22"/>
               </w:rPr>
-              <w:t>Python for data analysis</w:t>
-            </w:r>
-            <w:r>
-              <w:rPr>
-                <w:rFonts w:eastAsia="Calibri" w:cs="Calibri" w:ascii="Calibri" w:hAnsi="Calibri"/>
-                <w:b/>
-                <w:color w:val="808080"/>
-                <w:sz w:val="22"/>
-                <w:szCs w:val="22"/>
-              </w:rPr>
-              <w:t xml:space="preserve">. " O'Reilly Media, Inc.".  </w:t>
+              <w:t>Hands-on machine learning with Scikit-Learn, Keras, and TensorFlow</w:t>
+            </w:r>
+            <w:r>
+              <w:rPr>
+                <w:rFonts w:eastAsia="Calibri" w:cs="Calibri" w:ascii="Calibri" w:hAnsi="Calibri"/>
+                <w:b/>
+                <w:color w:val="808080"/>
+                <w:sz w:val="22"/>
+                <w:szCs w:val="22"/>
+              </w:rPr>
+              <w:t xml:space="preserve">. " O'Reilly Media, Inc.". </w:t>
+            </w:r>
+            <w:r>
+              <w:rPr>
+                <w:rFonts w:eastAsia="Calibri" w:cs="Calibri" w:ascii="Calibri" w:hAnsi="Calibri"/>
+                <w:b/>
+                <w:color w:val="808080"/>
+                <w:sz w:val="22"/>
+                <w:szCs w:val="22"/>
+              </w:rPr>
+              <w:t>Capítulo 3</w:t>
             </w:r>
           </w:p>
           <w:p>
@@ -4410,7 +4690,84 @@
               </w:rPr>
             </w:pPr>
             <w:r>
+              <w:rPr>
+                <w:rFonts w:eastAsia="Calibri" w:cs="Calibri" w:ascii="Calibri" w:hAnsi="Calibri"/>
+                <w:b/>
+              </w:rPr>
+            </w:r>
+          </w:p>
+          <w:p>
+            <w:pPr>
+              <w:pStyle w:val="Normal1"/>
+              <w:jc w:val="both"/>
+              <w:rPr>
+                <w:rFonts w:ascii="Calibri" w:hAnsi="Calibri" w:eastAsia="Calibri" w:cs="Calibri"/>
+                <w:b/>
+              </w:rPr>
+            </w:pPr>
+            <w:r>
+              <w:rPr>
+                <w:rFonts w:eastAsia="Calibri" w:cs="Calibri" w:ascii="Calibri" w:hAnsi="Calibri"/>
+                <w:b/>
+                <w:color w:val="808080"/>
+                <w:sz w:val="22"/>
+                <w:szCs w:val="22"/>
+              </w:rPr>
+              <w:t xml:space="preserve">Bibliografía Complementaria: </w:t>
+            </w:r>
+          </w:p>
+          <w:p>
+            <w:pPr>
+              <w:pStyle w:val="Normal1"/>
+              <w:jc w:val="both"/>
+              <w:rPr>
+                <w:rFonts w:ascii="Calibri" w:hAnsi="Calibri" w:eastAsia="Calibri" w:cs="Calibri"/>
+                <w:b/>
+              </w:rPr>
+            </w:pPr>
+            <w:r>
               <w:rPr/>
+            </w:r>
+          </w:p>
+          <w:p>
+            <w:pPr>
+              <w:pStyle w:val="Normal1"/>
+              <w:jc w:val="both"/>
+              <w:rPr>
+                <w:rFonts w:ascii="Calibri" w:hAnsi="Calibri" w:eastAsia="Calibri" w:cs="Calibri"/>
+                <w:b/>
+              </w:rPr>
+            </w:pPr>
+            <w:r>
+              <w:rPr>
+                <w:rFonts w:eastAsia="Calibri" w:cs="Calibri" w:ascii="Calibri" w:hAnsi="Calibri"/>
+                <w:b/>
+                <w:color w:val="808080"/>
+                <w:sz w:val="22"/>
+                <w:szCs w:val="22"/>
+              </w:rPr>
+              <w:t xml:space="preserve">Chollet, F. (2021). </w:t>
+            </w:r>
+            <w:r>
+              <w:rPr>
+                <w:rFonts w:eastAsia="Calibri" w:cs="Calibri" w:ascii="Calibri" w:hAnsi="Calibri"/>
+                <w:b/>
+                <w:i/>
+                <w:color w:val="808080"/>
+                <w:sz w:val="22"/>
+                <w:szCs w:val="22"/>
+              </w:rPr>
+              <w:t>Deep learning with Python</w:t>
+            </w:r>
+            <w:r>
+              <w:rPr>
+                <w:rFonts w:eastAsia="Calibri" w:cs="Calibri" w:ascii="Calibri" w:hAnsi="Calibri"/>
+                <w:b/>
+                <w:color w:val="808080"/>
+                <w:sz w:val="22"/>
+                <w:szCs w:val="22"/>
+              </w:rPr>
+              <w:t>. Simon and Schuster.</w:t>
             </w:r>
           </w:p>
           <w:p>

</xml_diff>

<commit_message>
2 de abril 4
</commit_message>
<xml_diff>
--- a/promocion_investigacion_didactica_del_ml/virtualizacion_propuesta/PropuestasVirtualización_Marco.docx
+++ b/promocion_investigacion_didactica_del_ml/virtualizacion_propuesta/PropuestasVirtualización_Marco.docx
@@ -810,7 +810,7 @@
               <w:rPr>
                 <w:rFonts w:eastAsia="Calibri" w:cs="Calibri" w:ascii="Calibri" w:hAnsi="Calibri"/>
                 <w:b/>
-                <w:color w:val="808080"/>
+                <w:color w:val="000000"/>
                 <w:sz w:val="22"/>
                 <w:szCs w:val="22"/>
               </w:rPr>
@@ -857,7 +857,7 @@
               <w:rPr>
                 <w:rFonts w:eastAsia="Calibri" w:cs="Calibri" w:ascii="Calibri" w:hAnsi="Calibri"/>
                 <w:b/>
-                <w:color w:val="808080"/>
+                <w:color w:val="000000"/>
                 <w:sz w:val="22"/>
                 <w:szCs w:val="22"/>
               </w:rPr>
@@ -910,84 +910,7 @@
               </w:rPr>
             </w:pPr>
             <w:r>
-              <w:rPr>
-                <w:color w:val="808080"/>
-                <w:sz w:val="22"/>
-                <w:szCs w:val="22"/>
-              </w:rPr>
-              <w:t>Realizar una descripción general que considere el propósito del curso en coherencia con los objetivos de formación del programa académico.</w:t>
-            </w:r>
-          </w:p>
-          <w:p>
-            <w:pPr>
-              <w:pStyle w:val="Normal1"/>
-              <w:rPr>
-                <w:b/>
-                <w:sz w:val="22"/>
-                <w:szCs w:val="22"/>
-              </w:rPr>
-            </w:pPr>
-            <w:r>
-              <w:rPr>
-                <w:b/>
-                <w:sz w:val="22"/>
-                <w:szCs w:val="22"/>
-              </w:rPr>
-            </w:r>
-          </w:p>
-          <w:p>
-            <w:pPr>
-              <w:pStyle w:val="Normal1"/>
-              <w:rPr>
-                <w:b/>
-                <w:sz w:val="22"/>
-                <w:szCs w:val="22"/>
-              </w:rPr>
-            </w:pPr>
-            <w:r>
-              <w:rPr>
-                <w:b/>
-                <w:color w:val="808080"/>
-                <w:sz w:val="22"/>
-                <w:szCs w:val="22"/>
-              </w:rPr>
-              <w:t>**Curso de Introducción al Machine Learning con Python**</w:t>
-            </w:r>
-          </w:p>
-          <w:p>
-            <w:pPr>
-              <w:pStyle w:val="Normal1"/>
-              <w:rPr>
-                <w:b/>
-                <w:sz w:val="22"/>
-                <w:szCs w:val="22"/>
-              </w:rPr>
-            </w:pPr>
-            <w:r>
-              <w:rPr>
-                <w:b/>
-                <w:sz w:val="22"/>
-                <w:szCs w:val="22"/>
-              </w:rPr>
-            </w:r>
-          </w:p>
-          <w:p>
-            <w:pPr>
-              <w:pStyle w:val="Normal1"/>
-              <w:rPr>
-                <w:b/>
-                <w:sz w:val="22"/>
-                <w:szCs w:val="22"/>
-              </w:rPr>
-            </w:pPr>
-            <w:r>
-              <w:rPr>
-                <w:b/>
-                <w:color w:val="808080"/>
-                <w:sz w:val="22"/>
-                <w:szCs w:val="22"/>
-              </w:rPr>
-              <w:t>**Descripción:**</w:t>
+              <w:rPr/>
             </w:r>
           </w:p>
           <w:p>
@@ -1042,26 +965,26 @@
                 <w:sz w:val="22"/>
                 <w:szCs w:val="22"/>
               </w:rPr>
-              <w:t>**Contenidos:**</w:t>
-            </w:r>
-          </w:p>
-          <w:p>
-            <w:pPr>
-              <w:pStyle w:val="Normal1"/>
-              <w:rPr>
-                <w:b/>
-                <w:sz w:val="22"/>
-                <w:szCs w:val="22"/>
-              </w:rPr>
-            </w:pPr>
-            <w:r>
-              <w:rPr>
-                <w:b/>
-                <w:color w:val="808080"/>
-                <w:sz w:val="22"/>
-                <w:szCs w:val="22"/>
-              </w:rPr>
-              <w:t>1. **Introducción a Python para Ciencia de Datos:**</w:t>
+              <w:t>Contenidos:</w:t>
+            </w:r>
+          </w:p>
+          <w:p>
+            <w:pPr>
+              <w:pStyle w:val="Normal1"/>
+              <w:rPr>
+                <w:b/>
+                <w:sz w:val="22"/>
+                <w:szCs w:val="22"/>
+              </w:rPr>
+            </w:pPr>
+            <w:r>
+              <w:rPr>
+                <w:b/>
+                <w:color w:val="808080"/>
+                <w:sz w:val="22"/>
+                <w:szCs w:val="22"/>
+              </w:rPr>
+              <w:t>1. Introducción a Python para Ciencia de Datos:</w:t>
             </w:r>
           </w:p>
           <w:p>
@@ -1144,7 +1067,25 @@
                 <w:sz w:val="22"/>
                 <w:szCs w:val="22"/>
               </w:rPr>
-              <w:t>y plothy</w:t>
+              <w:t xml:space="preserve">y </w:t>
+            </w:r>
+            <w:r>
+              <w:rPr>
+                <w:b/>
+                <w:color w:val="808080"/>
+                <w:sz w:val="22"/>
+                <w:szCs w:val="22"/>
+              </w:rPr>
+              <w:t>P</w:t>
+            </w:r>
+            <w:r>
+              <w:rPr>
+                <w:b/>
+                <w:color w:val="808080"/>
+                <w:sz w:val="22"/>
+                <w:szCs w:val="22"/>
+              </w:rPr>
+              <w:t>lothy</w:t>
             </w:r>
             <w:r>
               <w:rPr>
@@ -1181,6 +1122,43 @@
                 <w:sz w:val="22"/>
                 <w:szCs w:val="22"/>
               </w:rPr>
+              <w:t xml:space="preserve">- </w:t>
+            </w:r>
+            <w:r>
+              <w:rPr>
+                <w:b/>
+                <w:color w:val="808080"/>
+                <w:sz w:val="22"/>
+                <w:szCs w:val="22"/>
+              </w:rPr>
+              <w:t>Preprocesamiento de datos con sklearn</w:t>
+            </w:r>
+          </w:p>
+          <w:p>
+            <w:pPr>
+              <w:pStyle w:val="Normal1"/>
+              <w:rPr>
+                <w:b/>
+                <w:sz w:val="22"/>
+                <w:szCs w:val="22"/>
+              </w:rPr>
+            </w:pPr>
+            <w:r>
+              <w:rPr>
+                <w:b/>
+                <w:color w:val="808080"/>
+                <w:sz w:val="22"/>
+                <w:szCs w:val="22"/>
+              </w:rPr>
+              <w:t xml:space="preserve">   </w:t>
+            </w:r>
+            <w:r>
+              <w:rPr>
+                <w:b/>
+                <w:color w:val="808080"/>
+                <w:sz w:val="22"/>
+                <w:szCs w:val="22"/>
+              </w:rPr>
               <w:t xml:space="preserve">- Manipulación y visualización de datos con Pandas, Matplotlib </w:t>
             </w:r>
             <w:r>
@@ -1253,7 +1231,7 @@
                 <w:sz w:val="22"/>
                 <w:szCs w:val="22"/>
               </w:rPr>
-              <w:t>2. **Elementos Básicos de Estadística para Ciencia de Datos:**</w:t>
+              <w:t>2. Elementos Básicos de Estadística para Ciencia de Datos:</w:t>
             </w:r>
           </w:p>
           <w:p>
@@ -1281,7 +1259,25 @@
                 <w:sz w:val="22"/>
                 <w:szCs w:val="22"/>
               </w:rPr>
-              <w:t>- Estadísticas descriptivas: medidas de tendencia central, dispersión y distribución.</w:t>
+              <w:t xml:space="preserve">- Estadísticas descriptivas: medidas de tendencia central </w:t>
+            </w:r>
+            <w:r>
+              <w:rPr>
+                <w:b/>
+                <w:color w:val="808080"/>
+                <w:sz w:val="22"/>
+                <w:szCs w:val="22"/>
+              </w:rPr>
+              <w:t>y</w:t>
+            </w:r>
+            <w:r>
+              <w:rPr>
+                <w:b/>
+                <w:color w:val="808080"/>
+                <w:sz w:val="22"/>
+                <w:szCs w:val="22"/>
+              </w:rPr>
+              <w:t xml:space="preserve"> dispersión.</w:t>
             </w:r>
           </w:p>
           <w:p>
@@ -1309,7 +1305,16 @@
                 <w:sz w:val="22"/>
                 <w:szCs w:val="22"/>
               </w:rPr>
-              <w:t>- Probabilidad y distribuciones de probabilidad.</w:t>
+              <w:t xml:space="preserve">- </w:t>
+            </w:r>
+            <w:r>
+              <w:rPr>
+                <w:b/>
+                <w:color w:val="808080"/>
+                <w:sz w:val="22"/>
+                <w:szCs w:val="22"/>
+              </w:rPr>
+              <w:t xml:space="preserve">Las distribuciones de probabilidad uniforme y normal. </w:t>
             </w:r>
           </w:p>
           <w:p>
@@ -1391,7 +1396,7 @@
                 <w:sz w:val="22"/>
                 <w:szCs w:val="22"/>
               </w:rPr>
-              <w:t>3. **Modelos de Regresión:**</w:t>
+              <w:t>3. Modelos de Regresión:</w:t>
             </w:r>
           </w:p>
           <w:p>
@@ -1511,7 +1516,7 @@
                 <w:sz w:val="22"/>
                 <w:szCs w:val="22"/>
               </w:rPr>
-              <w:t>4. **Modelos de Clasificación:**</w:t>
+              <w:t>4. Modelos de Clasificación:</w:t>
             </w:r>
           </w:p>
           <w:p>
@@ -1649,7 +1654,7 @@
                 <w:sz w:val="22"/>
                 <w:szCs w:val="22"/>
               </w:rPr>
-              <w:t>5. **Aplicación Práctica con Datos Reales del Proyecto Investigativo Antioquia Mira Su Cielo:**</w:t>
+              <w:t>5. Aplicación Práctica con Datos Reales del Proyecto Investigativo Antioquia Mira Su Cielo:</w:t>
             </w:r>
           </w:p>
           <w:p>
@@ -2047,36 +2052,6 @@
                 <w:sz w:val="22"/>
                 <w:szCs w:val="22"/>
               </w:rPr>
-              <w:t>**Justificación:**</w:t>
-            </w:r>
-          </w:p>
-          <w:p>
-            <w:pPr>
-              <w:pStyle w:val="Normal1"/>
-              <w:rPr>
-                <w:rFonts w:ascii="Calibri" w:hAnsi="Calibri" w:eastAsia="Calibri" w:cs="Calibri"/>
-              </w:rPr>
-            </w:pPr>
-            <w:r>
-              <w:rPr>
-                <w:rFonts w:eastAsia="Calibri" w:cs="Calibri" w:ascii="Calibri" w:hAnsi="Calibri"/>
-              </w:rPr>
-            </w:r>
-          </w:p>
-          <w:p>
-            <w:pPr>
-              <w:pStyle w:val="Normal1"/>
-              <w:rPr>
-                <w:rFonts w:ascii="Calibri" w:hAnsi="Calibri" w:eastAsia="Calibri" w:cs="Calibri"/>
-              </w:rPr>
-            </w:pPr>
-            <w:r>
-              <w:rPr>
-                <w:rFonts w:eastAsia="Calibri" w:cs="Calibri" w:ascii="Calibri" w:hAnsi="Calibri"/>
-                <w:color w:val="808080"/>
-                <w:sz w:val="22"/>
-                <w:szCs w:val="22"/>
-              </w:rPr>
               <w:t>La ciencia de datos y el machine learning son áreas de creciente importancia en el mundo contemporáneo, con aplicaciones en una amplia variedad de campos, desde la investigación científica hasta la toma de decisiones empresariales. La Universidad de Antioquia reconoce la necesidad de proporcionar a sus estudiantes y profesionales herramientas y habilidades en estas áreas para enfrentar los desafíos del mundo laboral actual y contribuir al avance de la investigación y el desarrollo en la región.</w:t>
             </w:r>
           </w:p>
@@ -2366,20 +2341,6 @@
               <w:rPr>
                 <w:rFonts w:eastAsia="Calibri" w:cs="Calibri" w:ascii="Calibri" w:hAnsi="Calibri"/>
               </w:rPr>
-              <w:t>**Objetivo General:**</w:t>
-            </w:r>
-          </w:p>
-          <w:p>
-            <w:pPr>
-              <w:pStyle w:val="Normal1"/>
-              <w:rPr>
-                <w:rFonts w:ascii="Calibri" w:hAnsi="Calibri" w:eastAsia="Calibri" w:cs="Calibri"/>
-              </w:rPr>
-            </w:pPr>
-            <w:r>
-              <w:rPr>
-                <w:rFonts w:eastAsia="Calibri" w:cs="Calibri" w:ascii="Calibri" w:hAnsi="Calibri"/>
-              </w:rPr>
               <w:t>Al finalizar el curso, los participantes serán capaces de aplicar técnicas básicas de machine learning utilizando el lenguaje de programación Python y bibliotecas especializadas en ciencia de datos para analizar y modelar datos, así como evaluar la eficacia de los modelos generados.</w:t>
             </w:r>
           </w:p>
@@ -3134,7 +3095,7 @@
                 <w:sz w:val="22"/>
                 <w:szCs w:val="22"/>
               </w:rPr>
-              <w:t>6. **Fortalecer la Habilidad para Comunicar Resultados y Conclusiones:**</w:t>
+              <w:t>6. Fortalecer la Habilidad para Comunicar Resultados y Conclusiones:</w:t>
             </w:r>
           </w:p>
           <w:p>
@@ -3497,6 +3458,59 @@
               </w:rPr>
               <w:t>Describa las unidades o temas y contenidos a desarrollar</w:t>
             </w:r>
+            <w:r>
+              <w:rPr>
+                <w:b/>
+                <w:color w:val="808080"/>
+                <w:sz w:val="22"/>
+                <w:szCs w:val="22"/>
+              </w:rPr>
+              <w:t xml:space="preserve">  </w:t>
+            </w:r>
+          </w:p>
+          <w:p>
+            <w:pPr>
+              <w:pStyle w:val="Normal1"/>
+              <w:rPr>
+                <w:b/>
+              </w:rPr>
+            </w:pPr>
+            <w:r>
+              <w:rPr/>
+            </w:r>
+          </w:p>
+          <w:p>
+            <w:pPr>
+              <w:pStyle w:val="Normal1"/>
+              <w:rPr>
+                <w:b/>
+              </w:rPr>
+            </w:pPr>
+            <w:r>
+              <w:rPr/>
+            </w:r>
+          </w:p>
+          <w:p>
+            <w:pPr>
+              <w:pStyle w:val="Normal1"/>
+              <w:rPr>
+                <w:b/>
+              </w:rPr>
+            </w:pPr>
+            <w:r>
+              <w:rPr/>
+            </w:r>
+          </w:p>
+          <w:p>
+            <w:pPr>
+              <w:pStyle w:val="Normal1"/>
+              <w:rPr>
+                <w:b/>
+              </w:rPr>
+            </w:pPr>
+            <w:r>
+              <w:rPr/>
+            </w:r>
           </w:p>
         </w:tc>
       </w:tr>
@@ -3530,7 +3544,59 @@
                 <w:sz w:val="22"/>
                 <w:szCs w:val="22"/>
               </w:rPr>
-              <w:t>Unidades:</w:t>
+              <w:t xml:space="preserve">Unidades:    </w:t>
+            </w:r>
+          </w:p>
+          <w:p>
+            <w:pPr>
+              <w:pStyle w:val="Normal1"/>
+              <w:rPr>
+                <w:b/>
+                <w:sz w:val="22"/>
+                <w:szCs w:val="22"/>
+              </w:rPr>
+            </w:pPr>
+            <w:r>
+              <w:rPr/>
+            </w:r>
+          </w:p>
+          <w:p>
+            <w:pPr>
+              <w:pStyle w:val="Normal1"/>
+              <w:rPr>
+                <w:b/>
+                <w:sz w:val="22"/>
+                <w:szCs w:val="22"/>
+              </w:rPr>
+            </w:pPr>
+            <w:r>
+              <w:rPr/>
+            </w:r>
+          </w:p>
+          <w:p>
+            <w:pPr>
+              <w:pStyle w:val="Normal1"/>
+              <w:rPr>
+                <w:b/>
+                <w:sz w:val="22"/>
+                <w:szCs w:val="22"/>
+              </w:rPr>
+            </w:pPr>
+            <w:r>
+              <w:rPr/>
+            </w:r>
+          </w:p>
+          <w:p>
+            <w:pPr>
+              <w:pStyle w:val="Normal1"/>
+              <w:rPr>
+                <w:b/>
+                <w:sz w:val="22"/>
+                <w:szCs w:val="22"/>
+              </w:rPr>
+            </w:pPr>
+            <w:r>
+              <w:rPr/>
             </w:r>
           </w:p>
         </w:tc>
@@ -4842,8 +4908,8 @@
       </w:tblPr>
       <w:tblGrid>
         <w:gridCol w:w="3254"/>
-        <w:gridCol w:w="2014"/>
-        <w:gridCol w:w="2006"/>
+        <w:gridCol w:w="2234"/>
+        <w:gridCol w:w="1786"/>
         <w:gridCol w:w="1215"/>
         <w:gridCol w:w="1035"/>
         <w:gridCol w:w="960"/>
@@ -4961,7 +5027,7 @@
         </w:tc>
         <w:tc>
           <w:tcPr>
-            <w:tcW w:w="2014" w:type="dxa"/>
+            <w:tcW w:w="2234" w:type="dxa"/>
             <w:tcBorders>
               <w:top w:val="single" w:sz="4" w:space="0" w:color="7F7F7F"/>
               <w:left w:val="single" w:sz="4" w:space="0" w:color="7F7F7F"/>
@@ -4995,7 +5061,7 @@
         </w:tc>
         <w:tc>
           <w:tcPr>
-            <w:tcW w:w="2006" w:type="dxa"/>
+            <w:tcW w:w="1786" w:type="dxa"/>
             <w:tcBorders>
               <w:top w:val="single" w:sz="4" w:space="0" w:color="7F7F7F"/>
               <w:left w:val="single" w:sz="4" w:space="0" w:color="7F7F7F"/>
@@ -5155,12 +5221,13 @@
               <w:rPr>
                 <w:rFonts w:eastAsia="Calibri" w:cs="Calibri" w:ascii="Calibri" w:hAnsi="Calibri"/>
               </w:rPr>
-            </w:r>
-          </w:p>
-        </w:tc>
-        <w:tc>
-          <w:tcPr>
-            <w:tcW w:w="2014" w:type="dxa"/>
+              <w:t>Marco Julio Cañas Campillo</w:t>
+            </w:r>
+          </w:p>
+        </w:tc>
+        <w:tc>
+          <w:tcPr>
+            <w:tcW w:w="2234" w:type="dxa"/>
             <w:tcBorders>
               <w:top w:val="single" w:sz="4" w:space="0" w:color="7F7F7F"/>
               <w:left w:val="single" w:sz="4" w:space="0" w:color="7F7F7F"/>
@@ -5182,12 +5249,13 @@
               <w:rPr>
                 <w:rFonts w:eastAsia="Calibri" w:cs="Calibri" w:ascii="Calibri" w:hAnsi="Calibri"/>
               </w:rPr>
-            </w:r>
-          </w:p>
-        </w:tc>
-        <w:tc>
-          <w:tcPr>
-            <w:tcW w:w="2006" w:type="dxa"/>
+              <w:t>Dirección de regionalización</w:t>
+            </w:r>
+          </w:p>
+        </w:tc>
+        <w:tc>
+          <w:tcPr>
+            <w:tcW w:w="1786" w:type="dxa"/>
             <w:tcBorders>
               <w:top w:val="single" w:sz="4" w:space="0" w:color="7F7F7F"/>
               <w:left w:val="single" w:sz="4" w:space="0" w:color="7F7F7F"/>
@@ -5209,6 +5277,7 @@
               <w:rPr>
                 <w:rFonts w:eastAsia="Calibri" w:cs="Calibri" w:ascii="Calibri" w:hAnsi="Calibri"/>
               </w:rPr>
+              <w:t>Licenciado en Matemáticas y Física</w:t>
             </w:r>
           </w:p>
         </w:tc>
@@ -5238,6 +5307,7 @@
                 <w:sz w:val="20"/>
                 <w:szCs w:val="20"/>
               </w:rPr>
+              <w:t>1, 2, 3, 4</w:t>
             </w:r>
           </w:p>
         </w:tc>
@@ -5334,7 +5404,7 @@
         </w:tc>
         <w:tc>
           <w:tcPr>
-            <w:tcW w:w="2014" w:type="dxa"/>
+            <w:tcW w:w="2234" w:type="dxa"/>
             <w:tcBorders>
               <w:top w:val="single" w:sz="4" w:space="0" w:color="7F7F7F"/>
               <w:left w:val="single" w:sz="4" w:space="0" w:color="7F7F7F"/>
@@ -5361,7 +5431,7 @@
         </w:tc>
         <w:tc>
           <w:tcPr>
-            <w:tcW w:w="2006" w:type="dxa"/>
+            <w:tcW w:w="1786" w:type="dxa"/>
             <w:tcBorders>
               <w:top w:val="single" w:sz="4" w:space="0" w:color="7F7F7F"/>
               <w:left w:val="single" w:sz="4" w:space="0" w:color="7F7F7F"/>
@@ -5508,7 +5578,7 @@
         </w:tc>
         <w:tc>
           <w:tcPr>
-            <w:tcW w:w="2014" w:type="dxa"/>
+            <w:tcW w:w="2234" w:type="dxa"/>
             <w:tcBorders>
               <w:top w:val="single" w:sz="4" w:space="0" w:color="7F7F7F"/>
               <w:left w:val="single" w:sz="4" w:space="0" w:color="7F7F7F"/>
@@ -5535,7 +5605,7 @@
         </w:tc>
         <w:tc>
           <w:tcPr>
-            <w:tcW w:w="2006" w:type="dxa"/>
+            <w:tcW w:w="1786" w:type="dxa"/>
             <w:tcBorders>
               <w:top w:val="single" w:sz="4" w:space="0" w:color="7F7F7F"/>
               <w:left w:val="single" w:sz="4" w:space="0" w:color="7F7F7F"/>
@@ -5682,7 +5752,7 @@
         </w:tc>
         <w:tc>
           <w:tcPr>
-            <w:tcW w:w="2014" w:type="dxa"/>
+            <w:tcW w:w="2234" w:type="dxa"/>
             <w:tcBorders>
               <w:top w:val="single" w:sz="4" w:space="0" w:color="7F7F7F"/>
               <w:left w:val="single" w:sz="4" w:space="0" w:color="7F7F7F"/>
@@ -5709,7 +5779,7 @@
         </w:tc>
         <w:tc>
           <w:tcPr>
-            <w:tcW w:w="2006" w:type="dxa"/>
+            <w:tcW w:w="1786" w:type="dxa"/>
             <w:tcBorders>
               <w:top w:val="single" w:sz="4" w:space="0" w:color="7F7F7F"/>
               <w:left w:val="single" w:sz="4" w:space="0" w:color="7F7F7F"/>

</xml_diff>